<commit_message>
Fixed drift startup comparison
</commit_message>
<xml_diff>
--- a/Manual/Short_ICP-Base_Manual.docx
+++ b/Manual/Short_ICP-Base_Manual.docx
@@ -2007,7 +2007,7 @@
           <w:iCs/>
           <w:lang w:val="en-US"/>
         </w:rPr>
-        <w:t>Additional features: Moving averag</w:t>
+        <w:t xml:space="preserve">Additional features: </w:t>
       </w:r>
       <w:r>
         <w:rPr>
@@ -2015,7 +2015,7 @@
           <w:iCs/>
           <w:lang w:val="en-US"/>
         </w:rPr>
-        <w:t>e</w:t>
+        <w:t>Moving averag</w:t>
       </w:r>
       <w:r>
         <w:rPr>
@@ -2023,7 +2023,7 @@
           <w:iCs/>
           <w:lang w:val="en-US"/>
         </w:rPr>
-        <w:t xml:space="preserve"> interval setting</w:t>
+        <w:t>e interval setting for line scans (right-click the Proceed in Matrix Mode Button</w:t>
       </w:r>
       <w:r>
         <w:rPr>
@@ -2031,1761 +2031,17 @@
           <w:iCs/>
           <w:lang w:val="en-US"/>
         </w:rPr>
-        <w:br w:type="page"/>
-      </w:r>
-    </w:p>
-    <w:p>
-      <w:pPr>
-        <w:pStyle w:val="Heading1"/>
-        <w:jc w:val="both"/>
-        <w:rPr>
-          <w:lang w:val="en-US"/>
-        </w:rPr>
-      </w:pPr>
-      <w:r>
-        <w:rPr>
-          <w:lang w:val="en-US"/>
-        </w:rPr>
-        <w:lastRenderedPageBreak/>
-        <w:t>Interval Module</w:t>
-      </w:r>
-    </w:p>
-    <w:p>
-      <w:pPr>
-        <w:jc w:val="both"/>
-        <w:rPr>
-          <w:lang w:val="en-US"/>
-        </w:rPr>
-      </w:pPr>
-      <w:r>
-        <w:rPr>
-          <w:lang w:val="en-US"/>
-        </w:rPr>
-        <w:t>In this module, the spikes are eliminated</w:t>
-      </w:r>
-      <w:r>
-        <w:rPr>
-          <w:lang w:val="en-US"/>
-        </w:rPr>
-        <w:t xml:space="preserve">, </w:t>
-      </w:r>
-      <w:r>
-        <w:rPr>
-          <w:lang w:val="en-US"/>
-        </w:rPr>
-        <w:t>the integration intervals are set</w:t>
-      </w:r>
-      <w:r>
-        <w:rPr>
-          <w:lang w:val="en-US"/>
-        </w:rPr>
-        <w:t xml:space="preserve"> and in case of inclusion analysis the host-inclusion-mixed signal </w:t>
-      </w:r>
-      <w:r>
-        <w:rPr>
-          <w:lang w:val="en-US"/>
-        </w:rPr>
-        <w:t>can be</w:t>
-      </w:r>
-      <w:r>
-        <w:rPr>
-          <w:lang w:val="en-US"/>
-        </w:rPr>
-        <w:t xml:space="preserve"> </w:t>
-      </w:r>
-      <w:r>
-        <w:rPr>
-          <w:lang w:val="en-US"/>
-        </w:rPr>
-        <w:t>deconvolved</w:t>
-      </w:r>
-      <w:r>
-        <w:rPr>
-          <w:lang w:val="en-US"/>
-        </w:rPr>
-        <w:t>.</w:t>
-      </w:r>
-    </w:p>
-    <w:p>
-      <w:pPr>
-        <w:pStyle w:val="ListParagraph"/>
-        <w:numPr>
-          <w:ilvl w:val="0"/>
-          <w:numId w:val="8"/>
-        </w:numPr>
-        <w:jc w:val="both"/>
-        <w:rPr>
-          <w:lang w:val="en-US"/>
-        </w:rPr>
-      </w:pPr>
-      <w:r>
-        <w:rPr>
-          <w:lang w:val="en-US"/>
-        </w:rPr>
-        <w:t>Spike elimination</w:t>
-      </w:r>
-    </w:p>
-    <w:p>
-      <w:pPr>
-        <w:pStyle w:val="ListParagraph"/>
-        <w:numPr>
-          <w:ilvl w:val="1"/>
-          <w:numId w:val="8"/>
-        </w:numPr>
-        <w:jc w:val="both"/>
-        <w:rPr>
-          <w:lang w:val="en-US"/>
-        </w:rPr>
-      </w:pPr>
-      <w:r>
-        <w:rPr>
-          <w:lang w:val="en-US"/>
-        </w:rPr>
-        <w:t>Works spot-wise</w:t>
-      </w:r>
-      <w:r>
-        <w:rPr>
-          <w:lang w:val="en-US"/>
-        </w:rPr>
-        <w:t xml:space="preserve"> via 7</w:t>
-      </w:r>
-      <w:r>
-        <w:rPr>
-          <w:lang w:val="en-US"/>
-        </w:rPr>
-        <w:t xml:space="preserve"> and 9</w:t>
-      </w:r>
-      <w:r>
-        <w:rPr>
-          <w:lang w:val="en-US"/>
-        </w:rPr>
-        <w:t>-sweep window Grubbs’s test</w:t>
-      </w:r>
-    </w:p>
-    <w:p>
-      <w:pPr>
-        <w:pStyle w:val="ListParagraph"/>
-        <w:numPr>
-          <w:ilvl w:val="1"/>
-          <w:numId w:val="8"/>
-        </w:numPr>
-        <w:jc w:val="both"/>
-        <w:rPr>
-          <w:lang w:val="en-US"/>
-        </w:rPr>
-      </w:pPr>
-      <w:r>
-        <w:rPr>
-          <w:lang w:val="en-US"/>
-        </w:rPr>
-        <w:t>Press “Spike Elimination” button</w:t>
-      </w:r>
-    </w:p>
-    <w:p>
-      <w:pPr>
-        <w:pStyle w:val="ListParagraph"/>
-        <w:numPr>
-          <w:ilvl w:val="1"/>
-          <w:numId w:val="8"/>
-        </w:numPr>
-        <w:jc w:val="both"/>
-        <w:rPr>
-          <w:lang w:val="en-US"/>
-        </w:rPr>
-      </w:pPr>
-      <w:r>
-        <w:rPr>
-          <w:lang w:val="en-US"/>
-        </w:rPr>
-        <w:t>Right-click on button and press “Apply globall</w:t>
-      </w:r>
-      <w:r>
-        <w:rPr>
-          <w:lang w:val="en-US"/>
-        </w:rPr>
-        <w:t>y</w:t>
-      </w:r>
-      <w:r>
-        <w:rPr>
-          <w:lang w:val="en-US"/>
-        </w:rPr>
-        <w:t>”</w:t>
-      </w:r>
-    </w:p>
-    <w:p>
-      <w:pPr>
-        <w:pStyle w:val="ListParagraph"/>
-        <w:numPr>
-          <w:ilvl w:val="2"/>
-          <w:numId w:val="8"/>
-        </w:numPr>
-        <w:jc w:val="both"/>
-        <w:rPr>
-          <w:lang w:val="en-US"/>
-        </w:rPr>
-      </w:pPr>
-      <w:r>
-        <w:rPr>
-          <w:lang w:val="en-US"/>
-        </w:rPr>
-        <w:t>Same is possible to reset it</w:t>
-      </w:r>
-    </w:p>
-    <w:p>
-      <w:pPr>
-        <w:pStyle w:val="ListParagraph"/>
-        <w:numPr>
-          <w:ilvl w:val="1"/>
-          <w:numId w:val="8"/>
-        </w:numPr>
-        <w:jc w:val="both"/>
-        <w:rPr>
-          <w:lang w:val="en-US"/>
-        </w:rPr>
-      </w:pPr>
-      <w:r>
-        <w:rPr>
-          <w:lang w:val="en-US"/>
-        </w:rPr>
-        <w:t>No spikes are eliminating in the inclusion intervals</w:t>
-      </w:r>
-      <w:r>
-        <w:rPr>
-          <w:lang w:val="en-US"/>
-        </w:rPr>
-        <w:t xml:space="preserve"> by the “Spike Elimination” button or the “Apply globally” option</w:t>
-      </w:r>
-    </w:p>
-    <w:p>
-      <w:pPr>
-        <w:pStyle w:val="ListParagraph"/>
-        <w:numPr>
-          <w:ilvl w:val="2"/>
-          <w:numId w:val="8"/>
-        </w:numPr>
-        <w:jc w:val="both"/>
-        <w:rPr>
-          <w:lang w:val="en-US"/>
-        </w:rPr>
-      </w:pPr>
-      <w:r>
-        <w:rPr>
-          <w:lang w:val="en-US"/>
-        </w:rPr>
-        <w:t>Spikes in the inclusion intervals can be manually accepted or ignored via right-click on the “Spike elimination” button and then selecting “Individual (Inclusion only)</w:t>
-      </w:r>
-      <w:r>
-        <w:rPr>
-          <w:lang w:val="en-US"/>
-        </w:rPr>
-        <w:t>”.</w:t>
-      </w:r>
-    </w:p>
-    <w:p>
-      <w:pPr>
-        <w:pStyle w:val="ListParagraph"/>
-        <w:numPr>
-          <w:ilvl w:val="1"/>
-          <w:numId w:val="8"/>
-        </w:numPr>
-        <w:jc w:val="both"/>
-        <w:rPr>
-          <w:lang w:val="en-US"/>
-        </w:rPr>
-      </w:pPr>
-      <w:r>
-        <w:rPr>
-          <w:lang w:val="en-US"/>
-        </w:rPr>
-        <w:t>To manually accept or ignore all spikes select “Individual” after right-clicking the “Spike Elimination” button.</w:t>
-      </w:r>
-    </w:p>
-    <w:p>
-      <w:pPr>
-        <w:pStyle w:val="ListParagraph"/>
-        <w:numPr>
-          <w:ilvl w:val="1"/>
-          <w:numId w:val="8"/>
-        </w:numPr>
-        <w:jc w:val="both"/>
-        <w:rPr>
-          <w:lang w:val="en-US"/>
-        </w:rPr>
-      </w:pPr>
-      <w:r>
-        <w:rPr>
-          <w:lang w:val="en-US"/>
-        </w:rPr>
-        <w:t>Change spike elimination settings in the menu on top</w:t>
-      </w:r>
-    </w:p>
-    <w:p>
-      <w:pPr>
-        <w:pStyle w:val="ListParagraph"/>
-        <w:numPr>
-          <w:ilvl w:val="0"/>
-          <w:numId w:val="8"/>
-        </w:numPr>
-        <w:jc w:val="both"/>
-        <w:rPr>
-          <w:lang w:val="en-US"/>
-        </w:rPr>
-      </w:pPr>
-      <w:r>
-        <w:rPr>
-          <w:lang w:val="en-US"/>
-        </w:rPr>
-        <w:t>I</w:t>
-      </w:r>
-      <w:r>
-        <w:rPr>
-          <w:lang w:val="en-US"/>
-        </w:rPr>
-        <w:t>nterval setting</w:t>
-      </w:r>
-    </w:p>
-    <w:p>
-      <w:pPr>
-        <w:pStyle w:val="ListParagraph"/>
-        <w:numPr>
-          <w:ilvl w:val="1"/>
-          <w:numId w:val="8"/>
-        </w:numPr>
-        <w:jc w:val="both"/>
-        <w:rPr>
-          <w:lang w:val="en-US"/>
-        </w:rPr>
-      </w:pPr>
-      <w:r>
-        <w:rPr>
-          <w:lang w:val="en-US"/>
-        </w:rPr>
-        <w:t>Global Interval Setting</w:t>
-      </w:r>
-    </w:p>
-    <w:p>
-      <w:pPr>
-        <w:pStyle w:val="ListParagraph"/>
-        <w:numPr>
-          <w:ilvl w:val="2"/>
-          <w:numId w:val="8"/>
-        </w:numPr>
-        <w:jc w:val="both"/>
-        <w:rPr>
-          <w:lang w:val="en-US"/>
-        </w:rPr>
-      </w:pPr>
-      <w:r>
-        <w:rPr>
-          <w:lang w:val="en-US"/>
-        </w:rPr>
-        <w:t>Changes the intervals globally</w:t>
-      </w:r>
-    </w:p>
-    <w:p>
-      <w:pPr>
-        <w:pStyle w:val="ListParagraph"/>
-        <w:numPr>
-          <w:ilvl w:val="2"/>
-          <w:numId w:val="8"/>
-        </w:numPr>
-        <w:jc w:val="both"/>
-        <w:rPr>
-          <w:lang w:val="en-US"/>
-        </w:rPr>
-      </w:pPr>
-      <w:r>
-        <w:rPr>
-          <w:lang w:val="en-US"/>
-        </w:rPr>
-        <w:t>Depends on the signal start and end as detected in the Import Module</w:t>
-      </w:r>
-    </w:p>
-    <w:p>
-      <w:pPr>
-        <w:pStyle w:val="ListParagraph"/>
-        <w:numPr>
-          <w:ilvl w:val="2"/>
-          <w:numId w:val="8"/>
-        </w:numPr>
-        <w:jc w:val="both"/>
-        <w:rPr>
-          <w:lang w:val="en-US"/>
-        </w:rPr>
-      </w:pPr>
-      <w:r>
-        <w:rPr>
-          <w:lang w:val="en-US"/>
-        </w:rPr>
-        <w:t xml:space="preserve">The numbers </w:t>
-      </w:r>
-      <w:r>
-        <w:rPr>
-          <w:lang w:val="en-US"/>
-        </w:rPr>
-        <w:t>and ± 1, ±10 are the number of sweeps that are intend from the starts and ends</w:t>
-      </w:r>
-    </w:p>
-    <w:p>
-      <w:pPr>
-        <w:pStyle w:val="ListParagraph"/>
-        <w:numPr>
-          <w:ilvl w:val="2"/>
-          <w:numId w:val="8"/>
-        </w:numPr>
-        <w:jc w:val="both"/>
-        <w:rPr>
-          <w:lang w:val="en-US"/>
-        </w:rPr>
-      </w:pPr>
-      <w:r>
-        <w:rPr>
-          <w:lang w:val="en-US"/>
-        </w:rPr>
-        <w:t>Also moves the intervals that were manually adjusted so watch out</w:t>
-      </w:r>
-    </w:p>
-    <w:p>
-      <w:pPr>
-        <w:pStyle w:val="ListParagraph"/>
-        <w:numPr>
-          <w:ilvl w:val="2"/>
-          <w:numId w:val="8"/>
-        </w:numPr>
-        <w:jc w:val="both"/>
-        <w:rPr>
-          <w:lang w:val="en-US"/>
-        </w:rPr>
-      </w:pPr>
-      <w:r>
-        <w:rPr>
-          <w:lang w:val="en-US"/>
-        </w:rPr>
-        <w:t>By right-clicking on the “Set XY” buttons the intervals can be adjusted spot group wise</w:t>
-      </w:r>
-    </w:p>
-    <w:p>
-      <w:pPr>
-        <w:pStyle w:val="ListParagraph"/>
-        <w:numPr>
-          <w:ilvl w:val="1"/>
-          <w:numId w:val="8"/>
-        </w:numPr>
-        <w:jc w:val="both"/>
-        <w:rPr>
-          <w:lang w:val="en-US"/>
-        </w:rPr>
-      </w:pPr>
-      <w:r>
-        <w:rPr>
-          <w:lang w:val="en-US"/>
-        </w:rPr>
-        <w:t>Local Interval Setting</w:t>
-      </w:r>
-    </w:p>
-    <w:p>
-      <w:pPr>
-        <w:pStyle w:val="ListParagraph"/>
-        <w:numPr>
-          <w:ilvl w:val="2"/>
-          <w:numId w:val="8"/>
-        </w:numPr>
-        <w:jc w:val="both"/>
-        <w:rPr>
-          <w:lang w:val="en-US"/>
-        </w:rPr>
-      </w:pPr>
-      <w:r>
-        <w:rPr>
-          <w:lang w:val="en-US"/>
-        </w:rPr>
-        <w:t>Set intervals by dragging and dropping the cursor over the plot</w:t>
-      </w:r>
-    </w:p>
-    <w:p>
-      <w:pPr>
-        <w:pStyle w:val="ListParagraph"/>
-        <w:numPr>
-          <w:ilvl w:val="2"/>
-          <w:numId w:val="8"/>
-        </w:numPr>
-        <w:jc w:val="both"/>
-        <w:rPr>
-          <w:lang w:val="en-US"/>
-        </w:rPr>
-      </w:pPr>
-      <w:r>
-        <w:rPr>
-          <w:lang w:val="en-US"/>
-        </w:rPr>
-        <w:t>In Inclusion Mode there is also the “Inclusion” interval</w:t>
-      </w:r>
-    </w:p>
-    <w:p>
-      <w:pPr>
-        <w:pStyle w:val="ListParagraph"/>
-        <w:numPr>
-          <w:ilvl w:val="1"/>
-          <w:numId w:val="8"/>
-        </w:numPr>
-        <w:jc w:val="both"/>
-        <w:rPr>
-          <w:lang w:val="en-US"/>
-        </w:rPr>
-      </w:pPr>
-      <w:r>
-        <w:rPr>
-          <w:lang w:val="en-US"/>
-        </w:rPr>
-        <w:t>Manually m</w:t>
-      </w:r>
-      <w:r>
-        <w:rPr>
-          <w:lang w:val="en-US"/>
-        </w:rPr>
-        <w:t>oving intervals</w:t>
-      </w:r>
-    </w:p>
-    <w:p>
-      <w:pPr>
-        <w:pStyle w:val="ListParagraph"/>
-        <w:numPr>
-          <w:ilvl w:val="2"/>
-          <w:numId w:val="8"/>
-        </w:numPr>
-        <w:jc w:val="both"/>
-        <w:rPr>
-          <w:lang w:val="en-US"/>
-        </w:rPr>
-      </w:pPr>
-      <w:r>
-        <w:rPr>
-          <w:lang w:val="en-US"/>
-        </w:rPr>
-        <w:t>Click, hold, drag and drop the middle or borders of the intervals to adjust them</w:t>
-      </w:r>
-    </w:p>
-    <w:p>
-      <w:pPr>
-        <w:pStyle w:val="ListParagraph"/>
-        <w:numPr>
-          <w:ilvl w:val="2"/>
-          <w:numId w:val="8"/>
-        </w:numPr>
-        <w:jc w:val="both"/>
-        <w:rPr>
-          <w:lang w:val="en-US"/>
-        </w:rPr>
-      </w:pPr>
-      <w:r>
-        <w:rPr>
-          <w:lang w:val="en-US"/>
-        </w:rPr>
-        <w:t>This just changes the one interval that was moved</w:t>
-      </w:r>
-    </w:p>
-    <w:p>
-      <w:pPr>
-        <w:pStyle w:val="ListParagraph"/>
-        <w:numPr>
-          <w:ilvl w:val="0"/>
-          <w:numId w:val="8"/>
-        </w:numPr>
-        <w:jc w:val="both"/>
-        <w:rPr>
-          <w:lang w:val="en-US"/>
-        </w:rPr>
-      </w:pPr>
-      <w:r>
-        <w:rPr>
-          <w:lang w:val="en-US"/>
-        </w:rPr>
-        <w:t xml:space="preserve">Host-Inclusion </w:t>
-      </w:r>
-      <w:r>
-        <w:rPr>
-          <w:lang w:val="en-US"/>
-        </w:rPr>
-        <w:t>Signal unmixing</w:t>
-      </w:r>
-    </w:p>
-    <w:p>
-      <w:pPr>
-        <w:pStyle w:val="ListParagraph"/>
-        <w:numPr>
-          <w:ilvl w:val="1"/>
-          <w:numId w:val="8"/>
-        </w:numPr>
-        <w:jc w:val="both"/>
-        <w:rPr>
-          <w:lang w:val="en-US"/>
-        </w:rPr>
-      </w:pPr>
-      <w:r>
-        <w:rPr>
-          <w:lang w:val="en-US"/>
-        </w:rPr>
-        <w:t>Only in Inclusion Mode</w:t>
-      </w:r>
-    </w:p>
-    <w:p>
-      <w:pPr>
-        <w:pStyle w:val="ListParagraph"/>
-        <w:numPr>
-          <w:ilvl w:val="1"/>
-          <w:numId w:val="8"/>
-        </w:numPr>
-        <w:jc w:val="both"/>
-        <w:rPr>
-          <w:lang w:val="en-US"/>
-        </w:rPr>
-      </w:pPr>
-      <w:r>
-        <w:rPr>
-          <w:lang w:val="en-US"/>
-        </w:rPr>
-        <w:t>Only visible when plotting background-corrected</w:t>
-      </w:r>
-    </w:p>
-    <w:p>
-      <w:pPr>
-        <w:pStyle w:val="ListParagraph"/>
-        <w:numPr>
-          <w:ilvl w:val="1"/>
-          <w:numId w:val="8"/>
-        </w:numPr>
-        <w:jc w:val="both"/>
-        <w:rPr>
-          <w:lang w:val="en-US"/>
-        </w:rPr>
-      </w:pPr>
-      <w:r>
-        <w:rPr>
-          <w:lang w:val="en-US"/>
-        </w:rPr>
-        <w:t>Matrix-only tracer</w:t>
-      </w:r>
-    </w:p>
-    <w:p>
-      <w:pPr>
-        <w:pStyle w:val="ListParagraph"/>
-        <w:numPr>
-          <w:ilvl w:val="2"/>
-          <w:numId w:val="8"/>
-        </w:numPr>
-        <w:jc w:val="both"/>
-        <w:rPr>
-          <w:lang w:val="en-US"/>
-        </w:rPr>
-      </w:pPr>
-      <w:r>
-        <w:rPr>
-          <w:lang w:val="en-US"/>
-        </w:rPr>
-        <w:t>Choose element and spot to take the host from</w:t>
-      </w:r>
-    </w:p>
-    <w:p>
-      <w:pPr>
-        <w:pStyle w:val="ListParagraph"/>
-        <w:numPr>
-          <w:ilvl w:val="1"/>
-          <w:numId w:val="8"/>
-        </w:numPr>
-        <w:jc w:val="both"/>
-        <w:rPr>
-          <w:lang w:val="en-US"/>
-        </w:rPr>
-      </w:pPr>
-      <w:r>
-        <w:rPr>
-          <w:lang w:val="en-US"/>
-        </w:rPr>
-        <w:t>Two internal standards</w:t>
-      </w:r>
-    </w:p>
-    <w:p>
-      <w:pPr>
-        <w:pStyle w:val="ListParagraph"/>
-        <w:numPr>
-          <w:ilvl w:val="2"/>
-          <w:numId w:val="8"/>
-        </w:numPr>
-        <w:jc w:val="both"/>
-        <w:rPr>
-          <w:lang w:val="en-US"/>
-        </w:rPr>
-      </w:pPr>
-      <w:r>
-        <w:rPr>
-          <w:lang w:val="en-US"/>
-        </w:rPr>
-        <w:t>Values are input in Quantification Module</w:t>
-      </w:r>
-    </w:p>
-    <w:p>
-      <w:pPr>
-        <w:pStyle w:val="ListParagraph"/>
-        <w:numPr>
-          <w:ilvl w:val="0"/>
-          <w:numId w:val="8"/>
-        </w:numPr>
-        <w:jc w:val="both"/>
-        <w:rPr>
-          <w:lang w:val="en-US"/>
-        </w:rPr>
-      </w:pPr>
-      <w:r>
-        <w:rPr>
-          <w:lang w:val="en-US"/>
-        </w:rPr>
-        <w:t>Plot styles</w:t>
-      </w:r>
-    </w:p>
-    <w:p>
-      <w:pPr>
-        <w:pStyle w:val="ListParagraph"/>
-        <w:numPr>
-          <w:ilvl w:val="1"/>
-          <w:numId w:val="8"/>
-        </w:numPr>
-        <w:jc w:val="both"/>
-        <w:rPr>
-          <w:lang w:val="en-US"/>
-        </w:rPr>
-      </w:pPr>
-      <w:r>
-        <w:rPr>
-          <w:lang w:val="en-US"/>
-        </w:rPr>
-        <w:lastRenderedPageBreak/>
-        <w:t>Make them yourself</w:t>
-      </w:r>
-    </w:p>
-    <w:p>
-      <w:pPr>
-        <w:pStyle w:val="ListParagraph"/>
-        <w:numPr>
-          <w:ilvl w:val="2"/>
-          <w:numId w:val="8"/>
-        </w:numPr>
-        <w:jc w:val="both"/>
-        <w:rPr>
-          <w:lang w:val="en-US"/>
-        </w:rPr>
-      </w:pPr>
-      <w:r>
-        <w:rPr>
-          <w:lang w:val="en-US"/>
-        </w:rPr>
-        <w:t>Navigate to ICP-Base folder</w:t>
-      </w:r>
-      <w:r>
-        <w:rPr>
-          <w:lang w:val="en-US"/>
-        </w:rPr>
-        <w:t xml:space="preserve"> (Documents/ICP-Base)</w:t>
-      </w:r>
-    </w:p>
-    <w:p>
-      <w:pPr>
-        <w:pStyle w:val="ListParagraph"/>
-        <w:numPr>
-          <w:ilvl w:val="2"/>
-          <w:numId w:val="8"/>
-        </w:numPr>
-        <w:jc w:val="both"/>
-        <w:rPr>
-          <w:lang w:val="en-US"/>
-        </w:rPr>
-      </w:pPr>
-      <w:r>
-        <w:rPr>
-          <w:lang w:val="en-US"/>
-        </w:rPr>
-        <w:t>Get subfolder “Plot_Styles”</w:t>
-      </w:r>
-    </w:p>
-    <w:p>
-      <w:pPr>
-        <w:pStyle w:val="ListParagraph"/>
-        <w:numPr>
-          <w:ilvl w:val="2"/>
-          <w:numId w:val="8"/>
-        </w:numPr>
-        <w:jc w:val="both"/>
-        <w:rPr>
-          <w:lang w:val="en-US"/>
-        </w:rPr>
-      </w:pPr>
-      <w:r>
-        <w:rPr>
-          <w:lang w:val="en-US"/>
-        </w:rPr>
-        <w:t>Based on .csv files</w:t>
-      </w:r>
-    </w:p>
-    <w:p>
-      <w:pPr>
-        <w:pStyle w:val="ListParagraph"/>
-        <w:numPr>
-          <w:ilvl w:val="3"/>
-          <w:numId w:val="8"/>
-        </w:numPr>
-        <w:jc w:val="both"/>
-        <w:rPr>
-          <w:lang w:val="en-US"/>
-        </w:rPr>
-      </w:pPr>
-      <w:r>
-        <w:rPr>
-          <w:lang w:val="en-US"/>
-        </w:rPr>
-        <w:t>Open/Delete/Change the plot styles</w:t>
-      </w:r>
-    </w:p>
-    <w:p>
-      <w:pPr>
-        <w:pStyle w:val="ListParagraph"/>
-        <w:numPr>
-          <w:ilvl w:val="3"/>
-          <w:numId w:val="8"/>
-        </w:numPr>
-        <w:jc w:val="both"/>
-        <w:rPr>
-          <w:lang w:val="en-US"/>
-        </w:rPr>
-      </w:pPr>
-      <w:r>
-        <w:rPr>
-          <w:lang w:val="en-US"/>
-        </w:rPr>
-        <w:t>Also able to plot ratios</w:t>
-      </w:r>
-    </w:p>
-    <w:p>
-      <w:pPr>
-        <w:pStyle w:val="ListParagraph"/>
-        <w:numPr>
-          <w:ilvl w:val="1"/>
-          <w:numId w:val="8"/>
-        </w:numPr>
-        <w:jc w:val="both"/>
-        <w:rPr>
-          <w:lang w:val="en-US"/>
-        </w:rPr>
-      </w:pPr>
-      <w:r>
-        <w:rPr>
-          <w:lang w:val="en-US"/>
-        </w:rPr>
-        <w:t>Right-click on the top right list box</w:t>
-      </w:r>
-    </w:p>
-    <w:p>
-      <w:pPr>
-        <w:pStyle w:val="ListParagraph"/>
-        <w:numPr>
-          <w:ilvl w:val="2"/>
-          <w:numId w:val="8"/>
-        </w:numPr>
-        <w:jc w:val="both"/>
-        <w:rPr>
-          <w:lang w:val="en-US"/>
-        </w:rPr>
-      </w:pPr>
-      <w:r>
-        <w:rPr>
-          <w:lang w:val="en-US"/>
-        </w:rPr>
-        <w:t>Press “Refresh” to load in new or changed plot style</w:t>
-      </w:r>
-    </w:p>
-    <w:p>
-      <w:pPr>
-        <w:pStyle w:val="ListParagraph"/>
-        <w:numPr>
-          <w:ilvl w:val="0"/>
-          <w:numId w:val="8"/>
-        </w:numPr>
-        <w:jc w:val="both"/>
-        <w:rPr>
-          <w:lang w:val="en-US"/>
-        </w:rPr>
-      </w:pPr>
-      <w:r>
-        <w:rPr>
-          <w:lang w:val="en-US"/>
-        </w:rPr>
-        <w:t>General visualization features</w:t>
-      </w:r>
-    </w:p>
-    <w:p>
-      <w:pPr>
-        <w:pStyle w:val="ListParagraph"/>
-        <w:numPr>
-          <w:ilvl w:val="1"/>
-          <w:numId w:val="8"/>
-        </w:numPr>
-        <w:jc w:val="both"/>
-        <w:rPr>
-          <w:lang w:val="en-US"/>
-        </w:rPr>
-      </w:pPr>
-      <w:r>
-        <w:rPr>
-          <w:lang w:val="en-US"/>
-        </w:rPr>
-        <w:t xml:space="preserve">If the built-in zoom function is used (top-right icons in the plot) make sure to </w:t>
-      </w:r>
-      <w:r>
-        <w:rPr>
-          <w:lang w:val="en-US"/>
-        </w:rPr>
-        <w:t>de</w:t>
-      </w:r>
-      <w:r>
-        <w:rPr>
-          <w:lang w:val="en-US"/>
-        </w:rPr>
-        <w:t>select the zoom function by clicking on it again. Otherwise you cannot move the intervals anymore.</w:t>
-      </w:r>
-    </w:p>
-    <w:p>
-      <w:pPr>
-        <w:jc w:val="both"/>
-        <w:rPr>
-          <w:b/>
-          <w:bCs/>
-          <w:lang w:val="en-US"/>
-        </w:rPr>
-      </w:pPr>
-      <w:r>
-        <w:rPr>
-          <w:b/>
-          <w:bCs/>
-          <w:lang w:val="en-US"/>
-        </w:rPr>
-        <w:t>If you</w:t>
-      </w:r>
-    </w:p>
-    <w:p>
-      <w:pPr>
-        <w:ind w:left="360"/>
-        <w:jc w:val="both"/>
-        <w:rPr>
-          <w:b/>
-          <w:bCs/>
-          <w:lang w:val="en-US"/>
-        </w:rPr>
-      </w:pPr>
-      <w:r>
-        <w:rPr>
-          <w:b/>
-          <w:bCs/>
-          <w:lang w:val="en-US"/>
-        </w:rPr>
-        <w:t xml:space="preserve">1. </w:t>
-      </w:r>
-      <w:r>
-        <w:rPr>
-          <w:b/>
-          <w:bCs/>
-          <w:lang w:val="en-US"/>
-        </w:rPr>
-        <w:t>Eliminated the spikes,</w:t>
-      </w:r>
-    </w:p>
-    <w:p>
-      <w:pPr>
-        <w:ind w:left="360"/>
-        <w:jc w:val="both"/>
-        <w:rPr>
-          <w:b/>
-          <w:bCs/>
-          <w:lang w:val="en-US"/>
-        </w:rPr>
-      </w:pPr>
-      <w:r>
-        <w:rPr>
-          <w:b/>
-          <w:bCs/>
-          <w:lang w:val="en-US"/>
-        </w:rPr>
-        <w:t xml:space="preserve">2. </w:t>
-      </w:r>
-      <w:r>
-        <w:rPr>
-          <w:b/>
-          <w:bCs/>
-          <w:lang w:val="en-US"/>
-        </w:rPr>
-        <w:t>set the integration intervals and</w:t>
-      </w:r>
-    </w:p>
-    <w:p>
-      <w:pPr>
-        <w:ind w:left="360"/>
-        <w:jc w:val="both"/>
-        <w:rPr>
-          <w:b/>
-          <w:bCs/>
-          <w:lang w:val="en-US"/>
-        </w:rPr>
-      </w:pPr>
-      <w:r>
-        <w:rPr>
-          <w:b/>
-          <w:bCs/>
-          <w:lang w:val="en-US"/>
-        </w:rPr>
-        <w:t>3. in case of inclusion analysis chose a method of unmixing</w:t>
-      </w:r>
-    </w:p>
-    <w:p>
-      <w:pPr>
-        <w:jc w:val="both"/>
-        <w:rPr>
-          <w:b/>
-          <w:bCs/>
-          <w:lang w:val="en-US"/>
-        </w:rPr>
-      </w:pPr>
-      <w:r>
-        <w:rPr>
-          <w:b/>
-          <w:bCs/>
-          <w:lang w:val="en-US"/>
-        </w:rPr>
-        <w:t xml:space="preserve">You can proceed </w:t>
-      </w:r>
-      <w:r>
-        <w:rPr>
-          <w:b/>
-          <w:bCs/>
-          <w:lang w:val="en-US"/>
-        </w:rPr>
-        <w:t>to the Classification Module</w:t>
-      </w:r>
-    </w:p>
-    <w:p>
-      <w:pPr>
-        <w:jc w:val="both"/>
-        <w:rPr>
-          <w:b/>
-          <w:bCs/>
-          <w:lang w:val="en-US"/>
-        </w:rPr>
-      </w:pPr>
-    </w:p>
-    <w:p>
-      <w:pPr>
-        <w:jc w:val="both"/>
-        <w:rPr>
+        <w:t>)</w:t>
+      </w:r>
+    </w:p>
+    <w:p>
+      <w:pPr>
+        <w:jc w:val="both"/>
+        <w:rPr>
+          <w:rFonts w:asciiTheme="majorHAnsi" w:eastAsiaTheme="majorEastAsia" w:hAnsiTheme="majorHAnsi" w:cstheme="majorBidi"/>
+          <w:b/>
           <w:i/>
           <w:iCs/>
-          <w:lang w:val="en-US"/>
-        </w:rPr>
-      </w:pPr>
-      <w:r>
-        <w:rPr>
-          <w:i/>
-          <w:iCs/>
-          <w:lang w:val="en-US"/>
-        </w:rPr>
-        <w:t xml:space="preserve">Additional features: </w:t>
-      </w:r>
-      <w:r>
-        <w:rPr>
-          <w:i/>
-          <w:iCs/>
-          <w:lang w:val="en-US"/>
-        </w:rPr>
-        <w:t xml:space="preserve">Spike elimination report, Change Plot Styles folder path, </w:t>
-      </w:r>
-      <w:r>
-        <w:rPr>
-          <w:i/>
-          <w:iCs/>
-          <w:lang w:val="en-US"/>
-        </w:rPr>
-        <w:t>add comments to spots</w:t>
-      </w:r>
-    </w:p>
-    <w:p>
-      <w:pPr>
-        <w:rPr>
-          <w:i/>
-          <w:iCs/>
-          <w:lang w:val="en-US"/>
-        </w:rPr>
-      </w:pPr>
-      <w:r>
-        <w:rPr>
-          <w:i/>
-          <w:iCs/>
-          <w:lang w:val="en-US"/>
-        </w:rPr>
-        <w:br w:type="page"/>
-      </w:r>
-    </w:p>
-    <w:p>
-      <w:pPr>
-        <w:pStyle w:val="Heading1"/>
-        <w:jc w:val="both"/>
-        <w:rPr>
-          <w:lang w:val="en-US"/>
-        </w:rPr>
-      </w:pPr>
-      <w:r>
-        <w:rPr>
-          <w:lang w:val="en-US"/>
-        </w:rPr>
-        <w:lastRenderedPageBreak/>
-        <w:t>Classification Module</w:t>
-      </w:r>
-    </w:p>
-    <w:p>
-      <w:pPr>
-        <w:jc w:val="both"/>
-        <w:rPr>
-          <w:lang w:val="en-US"/>
-        </w:rPr>
-      </w:pPr>
-      <w:r>
-        <w:rPr>
-          <w:lang w:val="en-US"/>
-        </w:rPr>
-        <w:t xml:space="preserve">In this module, </w:t>
-      </w:r>
-      <w:r>
-        <w:rPr>
-          <w:lang w:val="en-US"/>
-        </w:rPr>
-        <w:t>the spots are assigned roles</w:t>
-      </w:r>
-    </w:p>
-    <w:p>
-      <w:pPr>
-        <w:pStyle w:val="ListParagraph"/>
-        <w:numPr>
-          <w:ilvl w:val="0"/>
-          <w:numId w:val="9"/>
-        </w:numPr>
-        <w:jc w:val="both"/>
-        <w:rPr>
-          <w:lang w:val="en-US"/>
-        </w:rPr>
-      </w:pPr>
-      <w:r>
-        <w:rPr>
-          <w:lang w:val="en-US"/>
-        </w:rPr>
-        <w:t>Types</w:t>
-      </w:r>
-    </w:p>
-    <w:p>
-      <w:pPr>
-        <w:pStyle w:val="ListParagraph"/>
-        <w:numPr>
-          <w:ilvl w:val="1"/>
-          <w:numId w:val="9"/>
-        </w:numPr>
-        <w:jc w:val="both"/>
-        <w:rPr>
-          <w:lang w:val="en-US"/>
-        </w:rPr>
-      </w:pPr>
-      <w:r>
-        <w:rPr>
-          <w:lang w:val="en-US"/>
-        </w:rPr>
-        <w:t>“Unknown”</w:t>
-      </w:r>
-      <w:r>
-        <w:rPr>
-          <w:lang w:val="en-US"/>
-        </w:rPr>
-        <w:t xml:space="preserve"> </w:t>
-      </w:r>
-      <w:r>
-        <w:rPr>
-          <w:lang w:val="en-US"/>
-        </w:rPr>
-        <w:t>is an unknown</w:t>
-      </w:r>
-      <w:r>
-        <w:rPr>
-          <w:lang w:val="en-US"/>
-        </w:rPr>
-        <w:t xml:space="preserve"> that should be quantified</w:t>
-      </w:r>
-    </w:p>
-    <w:p>
-      <w:pPr>
-        <w:pStyle w:val="ListParagraph"/>
-        <w:numPr>
-          <w:ilvl w:val="1"/>
-          <w:numId w:val="9"/>
-        </w:numPr>
-        <w:jc w:val="both"/>
-        <w:rPr>
-          <w:lang w:val="en-US"/>
-        </w:rPr>
-      </w:pPr>
-      <w:r>
-        <w:rPr>
-          <w:lang w:val="en-US"/>
-        </w:rPr>
-        <w:t>“</w:t>
-      </w:r>
-      <w:r>
-        <w:rPr>
-          <w:lang w:val="en-US"/>
-        </w:rPr>
-        <w:t>Interference Correction Material</w:t>
-      </w:r>
-      <w:r>
-        <w:rPr>
-          <w:lang w:val="en-US"/>
-        </w:rPr>
-        <w:t>” (</w:t>
-      </w:r>
-      <w:r>
-        <w:rPr>
-          <w:lang w:val="en-US"/>
-        </w:rPr>
-        <w:t>ICM</w:t>
-      </w:r>
-      <w:r>
-        <w:rPr>
-          <w:lang w:val="en-US"/>
-        </w:rPr>
-        <w:t xml:space="preserve">) is </w:t>
-      </w:r>
-      <w:r>
-        <w:rPr>
-          <w:lang w:val="en-US"/>
-        </w:rPr>
-        <w:t>used to correct for interferences.</w:t>
-      </w:r>
-    </w:p>
-    <w:p>
-      <w:pPr>
-        <w:pStyle w:val="ListParagraph"/>
-        <w:numPr>
-          <w:ilvl w:val="1"/>
-          <w:numId w:val="9"/>
-        </w:numPr>
-        <w:jc w:val="both"/>
-        <w:rPr>
-          <w:lang w:val="en-US"/>
-        </w:rPr>
-      </w:pPr>
-      <w:r>
-        <w:rPr>
-          <w:lang w:val="en-US"/>
-        </w:rPr>
-        <w:t>“</w:t>
-      </w:r>
-      <w:r>
-        <w:rPr>
-          <w:lang w:val="en-US"/>
-        </w:rPr>
-        <w:t xml:space="preserve">Quality </w:t>
-      </w:r>
-      <w:r>
-        <w:rPr>
-          <w:lang w:val="en-US"/>
-        </w:rPr>
-        <w:t>C</w:t>
-      </w:r>
-      <w:r>
-        <w:rPr>
-          <w:lang w:val="en-US"/>
-        </w:rPr>
-        <w:t xml:space="preserve">ontrol </w:t>
-      </w:r>
-      <w:r>
-        <w:rPr>
-          <w:lang w:val="en-US"/>
-        </w:rPr>
-        <w:t>Reference Material</w:t>
-      </w:r>
-      <w:r>
-        <w:rPr>
-          <w:lang w:val="en-US"/>
-        </w:rPr>
-        <w:t>” (</w:t>
-      </w:r>
-      <w:r>
-        <w:rPr>
-          <w:lang w:val="en-US"/>
-        </w:rPr>
-        <w:t>Q</w:t>
-      </w:r>
-      <w:r>
-        <w:rPr>
-          <w:lang w:val="en-US"/>
-        </w:rPr>
-        <w:t>C</w:t>
-      </w:r>
-      <w:r>
-        <w:rPr>
-          <w:lang w:val="en-US"/>
-        </w:rPr>
-        <w:t>RM</w:t>
-      </w:r>
-      <w:r>
-        <w:rPr>
-          <w:lang w:val="en-US"/>
-        </w:rPr>
-        <w:t>) is treated like an unknown but has a known composition to which the results can be compared to.</w:t>
-      </w:r>
-    </w:p>
-    <w:p>
-      <w:pPr>
-        <w:pStyle w:val="ListParagraph"/>
-        <w:numPr>
-          <w:ilvl w:val="1"/>
-          <w:numId w:val="9"/>
-        </w:numPr>
-        <w:jc w:val="both"/>
-        <w:rPr>
-          <w:lang w:val="en-US"/>
-        </w:rPr>
-      </w:pPr>
-      <w:r>
-        <w:rPr>
-          <w:lang w:val="en-US"/>
-        </w:rPr>
-        <w:t>“</w:t>
-      </w:r>
-      <w:r>
-        <w:rPr>
-          <w:lang w:val="en-US"/>
-        </w:rPr>
-        <w:t>Calibrat</w:t>
-      </w:r>
-      <w:r>
-        <w:rPr>
-          <w:lang w:val="en-US"/>
-        </w:rPr>
-        <w:t>or</w:t>
-      </w:r>
-      <w:r>
-        <w:rPr>
-          <w:lang w:val="en-US"/>
-        </w:rPr>
-        <w:t>” (</w:t>
-      </w:r>
-      <w:r>
-        <w:rPr>
-          <w:lang w:val="en-US"/>
-        </w:rPr>
-        <w:t>C</w:t>
-      </w:r>
-      <w:r>
-        <w:rPr>
-          <w:lang w:val="en-US"/>
-        </w:rPr>
-        <w:t>AL</w:t>
-      </w:r>
-      <w:r>
-        <w:rPr>
-          <w:lang w:val="en-US"/>
-        </w:rPr>
-        <w:t>) is actually used for the quantification of the other types.</w:t>
-      </w:r>
-    </w:p>
-    <w:p>
-      <w:pPr>
-        <w:pStyle w:val="ListParagraph"/>
-        <w:numPr>
-          <w:ilvl w:val="0"/>
-          <w:numId w:val="9"/>
-        </w:numPr>
-        <w:jc w:val="both"/>
-        <w:rPr>
-          <w:lang w:val="en-US"/>
-        </w:rPr>
-      </w:pPr>
-      <w:r>
-        <w:rPr>
-          <w:lang w:val="en-US"/>
-        </w:rPr>
-        <w:t>Reference Materials</w:t>
-      </w:r>
-    </w:p>
-    <w:p>
-      <w:pPr>
-        <w:pStyle w:val="ListParagraph"/>
-        <w:numPr>
-          <w:ilvl w:val="1"/>
-          <w:numId w:val="9"/>
-        </w:numPr>
-        <w:jc w:val="both"/>
-        <w:rPr>
-          <w:lang w:val="en-US"/>
-        </w:rPr>
-      </w:pPr>
-      <w:r>
-        <w:rPr>
-          <w:lang w:val="en-US"/>
-        </w:rPr>
-        <w:t xml:space="preserve">Their compositions are stored in files in the subfolder </w:t>
-      </w:r>
-      <w:proofErr w:type="spellStart"/>
-      <w:r>
-        <w:rPr>
-          <w:lang w:val="en-US"/>
-        </w:rPr>
-        <w:t>RM_Files</w:t>
-      </w:r>
-      <w:proofErr w:type="spellEnd"/>
-      <w:r>
-        <w:rPr>
-          <w:lang w:val="en-US"/>
-        </w:rPr>
-        <w:t xml:space="preserve"> in the ICP-Base folder</w:t>
-      </w:r>
-      <w:r>
-        <w:rPr>
-          <w:lang w:val="en-US"/>
-        </w:rPr>
-        <w:t xml:space="preserve"> (Documents/ICP-Base)</w:t>
-      </w:r>
-      <w:r>
-        <w:rPr>
-          <w:lang w:val="en-US"/>
-        </w:rPr>
-        <w:t xml:space="preserve"> or in a custom set </w:t>
-      </w:r>
-      <w:proofErr w:type="spellStart"/>
-      <w:r>
-        <w:rPr>
-          <w:lang w:val="en-US"/>
-        </w:rPr>
-        <w:t>filepath</w:t>
-      </w:r>
-      <w:proofErr w:type="spellEnd"/>
-      <w:r>
-        <w:rPr>
-          <w:lang w:val="en-US"/>
-        </w:rPr>
-        <w:t xml:space="preserve"> (changed via the settings menu).</w:t>
-      </w:r>
-    </w:p>
-    <w:p>
-      <w:pPr>
-        <w:pStyle w:val="ListParagraph"/>
-        <w:numPr>
-          <w:ilvl w:val="1"/>
-          <w:numId w:val="9"/>
-        </w:numPr>
-        <w:jc w:val="both"/>
-        <w:rPr>
-          <w:lang w:val="en-US"/>
-        </w:rPr>
-      </w:pPr>
-      <w:r>
-        <w:rPr>
-          <w:lang w:val="en-US"/>
-        </w:rPr>
-        <w:t>Add/Change/Delete them as you like</w:t>
-      </w:r>
-    </w:p>
-    <w:p>
-      <w:pPr>
-        <w:pStyle w:val="ListParagraph"/>
-        <w:numPr>
-          <w:ilvl w:val="2"/>
-          <w:numId w:val="9"/>
-        </w:numPr>
-        <w:jc w:val="both"/>
-        <w:rPr>
-          <w:lang w:val="en-US"/>
-        </w:rPr>
-      </w:pPr>
-      <w:r>
-        <w:rPr>
-          <w:lang w:val="en-US"/>
-        </w:rPr>
-        <w:t>Press “Get RM files” to import the RM files from the folder</w:t>
-      </w:r>
-    </w:p>
-    <w:p>
-      <w:pPr>
-        <w:pStyle w:val="ListParagraph"/>
-        <w:numPr>
-          <w:ilvl w:val="0"/>
-          <w:numId w:val="9"/>
-        </w:numPr>
-        <w:jc w:val="both"/>
-        <w:rPr>
-          <w:lang w:val="en-US"/>
-        </w:rPr>
-      </w:pPr>
-      <w:r>
-        <w:rPr>
-          <w:lang w:val="en-US"/>
-        </w:rPr>
-        <w:t>Assign types and reference materials to the spots by selecting them directly in the table or via string search</w:t>
-      </w:r>
-    </w:p>
-    <w:p>
-      <w:pPr>
-        <w:pStyle w:val="ListParagraph"/>
-        <w:numPr>
-          <w:ilvl w:val="0"/>
-          <w:numId w:val="9"/>
-        </w:numPr>
-        <w:jc w:val="both"/>
-        <w:rPr>
-          <w:lang w:val="en-US"/>
-        </w:rPr>
-      </w:pPr>
-      <w:r>
-        <w:rPr>
-          <w:lang w:val="en-US"/>
-        </w:rPr>
-        <w:t>Assign bracket ids if you measured the same reference material with e.g. different spot sizes to separate them.</w:t>
-      </w:r>
-    </w:p>
-    <w:p>
-      <w:pPr>
-        <w:pStyle w:val="ListParagraph"/>
-        <w:numPr>
-          <w:ilvl w:val="1"/>
-          <w:numId w:val="9"/>
-        </w:numPr>
-        <w:jc w:val="both"/>
-        <w:rPr>
-          <w:lang w:val="en-US"/>
-        </w:rPr>
-      </w:pPr>
-      <w:r>
-        <w:rPr>
-          <w:lang w:val="en-US"/>
-        </w:rPr>
-        <w:t>Different reference materials do not have to be separated by the different bracket ids. They are already separated by the fact that they are different reference materials</w:t>
-      </w:r>
-    </w:p>
-    <w:p>
-      <w:pPr>
-        <w:pStyle w:val="ListParagraph"/>
-        <w:numPr>
-          <w:ilvl w:val="1"/>
-          <w:numId w:val="9"/>
-        </w:numPr>
-        <w:jc w:val="both"/>
-        <w:rPr>
-          <w:lang w:val="en-US"/>
-        </w:rPr>
-      </w:pPr>
-      <w:r>
-        <w:rPr>
-          <w:lang w:val="en-US"/>
-        </w:rPr>
-        <w:t>Bracket ids only should be used to separate spots of the same reference material</w:t>
-      </w:r>
-    </w:p>
-    <w:p>
-      <w:pPr>
-        <w:pStyle w:val="ListParagraph"/>
-        <w:numPr>
-          <w:ilvl w:val="0"/>
-          <w:numId w:val="9"/>
-        </w:numPr>
-        <w:jc w:val="both"/>
-        <w:rPr>
-          <w:lang w:val="en-US"/>
-        </w:rPr>
-      </w:pPr>
-      <w:r>
-        <w:rPr>
-          <w:lang w:val="en-US"/>
-        </w:rPr>
-        <w:t>Right click on a table row where an RM was assigned to look at the reference values of that RM.</w:t>
-      </w:r>
-      <w:r>
-        <w:rPr>
-          <w:lang w:val="en-US"/>
-        </w:rPr>
-        <w:t xml:space="preserve"> You can also read the path where the RM files are stored if you want to change them.</w:t>
-      </w:r>
-    </w:p>
-    <w:p>
-      <w:pPr>
-        <w:pStyle w:val="ListParagraph"/>
-        <w:numPr>
-          <w:ilvl w:val="0"/>
-          <w:numId w:val="9"/>
-        </w:numPr>
-        <w:jc w:val="both"/>
-        <w:rPr>
-          <w:lang w:val="en-US"/>
-        </w:rPr>
-      </w:pPr>
-      <w:r>
-        <w:rPr>
-          <w:lang w:val="en-US"/>
-        </w:rPr>
-        <w:t>Configure the interference correction if an ICM is chosen.</w:t>
-      </w:r>
-    </w:p>
-    <w:p>
-      <w:pPr>
-        <w:rPr>
-          <w:lang w:val="en-US"/>
-        </w:rPr>
-      </w:pPr>
-    </w:p>
-    <w:p>
-      <w:pPr>
-        <w:jc w:val="both"/>
-        <w:rPr>
-          <w:b/>
-          <w:bCs/>
-          <w:lang w:val="en-US"/>
-        </w:rPr>
-      </w:pPr>
-      <w:r>
-        <w:rPr>
-          <w:b/>
-          <w:bCs/>
-          <w:lang w:val="en-US"/>
-        </w:rPr>
-        <w:t>If you</w:t>
-      </w:r>
-    </w:p>
-    <w:p>
-      <w:pPr>
-        <w:ind w:left="360"/>
-        <w:jc w:val="both"/>
-        <w:rPr>
-          <w:b/>
-          <w:bCs/>
-          <w:lang w:val="en-US"/>
-        </w:rPr>
-      </w:pPr>
-      <w:r>
-        <w:rPr>
-          <w:b/>
-          <w:bCs/>
-          <w:lang w:val="en-US"/>
-        </w:rPr>
-        <w:t xml:space="preserve">1. </w:t>
-      </w:r>
-      <w:r>
-        <w:rPr>
-          <w:b/>
-          <w:bCs/>
-          <w:lang w:val="en-US"/>
-        </w:rPr>
-        <w:t>Classified ea</w:t>
-      </w:r>
-      <w:r>
-        <w:rPr>
-          <w:b/>
-          <w:bCs/>
-          <w:lang w:val="en-US"/>
-        </w:rPr>
-        <w:t xml:space="preserve">ch spot </w:t>
-      </w:r>
-      <w:r>
-        <w:rPr>
-          <w:b/>
-          <w:bCs/>
-          <w:lang w:val="en-US"/>
-        </w:rPr>
-        <w:t>has a role</w:t>
-      </w:r>
-      <w:r>
-        <w:rPr>
-          <w:b/>
-          <w:bCs/>
-          <w:lang w:val="en-US"/>
-        </w:rPr>
-        <w:t xml:space="preserve"> and</w:t>
-      </w:r>
-    </w:p>
-    <w:p>
-      <w:pPr>
-        <w:ind w:left="360"/>
-        <w:jc w:val="both"/>
-        <w:rPr>
-          <w:b/>
-          <w:bCs/>
-          <w:lang w:val="en-US"/>
-        </w:rPr>
-      </w:pPr>
-      <w:r>
-        <w:rPr>
-          <w:b/>
-          <w:bCs/>
-          <w:lang w:val="en-US"/>
-        </w:rPr>
-        <w:t xml:space="preserve">2. </w:t>
-      </w:r>
-      <w:r>
-        <w:rPr>
-          <w:b/>
-          <w:bCs/>
-          <w:lang w:val="en-US"/>
-        </w:rPr>
-        <w:t xml:space="preserve">separated the </w:t>
-      </w:r>
-      <w:r>
-        <w:rPr>
-          <w:b/>
-          <w:bCs/>
-          <w:lang w:val="en-US"/>
-        </w:rPr>
-        <w:t>CAL</w:t>
-      </w:r>
-      <w:r>
-        <w:rPr>
-          <w:b/>
-          <w:bCs/>
-          <w:lang w:val="en-US"/>
-        </w:rPr>
-        <w:t xml:space="preserve"> via bracket id (if necessary)</w:t>
-      </w:r>
-      <w:r>
-        <w:rPr>
-          <w:b/>
-          <w:bCs/>
-          <w:lang w:val="en-US"/>
-        </w:rPr>
-        <w:t xml:space="preserve"> and</w:t>
-      </w:r>
-    </w:p>
-    <w:p>
-      <w:pPr>
-        <w:ind w:left="360"/>
-        <w:jc w:val="both"/>
-        <w:rPr>
-          <w:b/>
-          <w:bCs/>
-          <w:lang w:val="en-US"/>
-        </w:rPr>
-      </w:pPr>
-      <w:r>
-        <w:rPr>
-          <w:b/>
-          <w:bCs/>
-          <w:lang w:val="en-US"/>
-        </w:rPr>
-        <w:t>3. configured the interference correction (if an ICM was chosen)</w:t>
-      </w:r>
-    </w:p>
-    <w:p>
-      <w:pPr>
-        <w:jc w:val="both"/>
-        <w:rPr>
-          <w:rFonts w:asciiTheme="majorHAnsi" w:eastAsiaTheme="majorEastAsia" w:hAnsiTheme="majorHAnsi" w:cstheme="majorBidi"/>
-          <w:b/>
           <w:color w:val="000000" w:themeColor="text1"/>
           <w:sz w:val="32"/>
           <w:szCs w:val="40"/>
@@ -3794,6 +2050,1032 @@
       </w:pPr>
       <w:r>
         <w:rPr>
+          <w:i/>
+          <w:iCs/>
+          <w:lang w:val="en-US"/>
+        </w:rPr>
+        <w:br w:type="page"/>
+      </w:r>
+    </w:p>
+    <w:p>
+      <w:pPr>
+        <w:pStyle w:val="Heading1"/>
+        <w:jc w:val="both"/>
+        <w:rPr>
+          <w:lang w:val="en-US"/>
+        </w:rPr>
+      </w:pPr>
+      <w:r>
+        <w:rPr>
+          <w:lang w:val="en-US"/>
+        </w:rPr>
+        <w:lastRenderedPageBreak/>
+        <w:t>Interval Module</w:t>
+      </w:r>
+    </w:p>
+    <w:p>
+      <w:pPr>
+        <w:jc w:val="both"/>
+        <w:rPr>
+          <w:lang w:val="en-US"/>
+        </w:rPr>
+      </w:pPr>
+      <w:r>
+        <w:rPr>
+          <w:lang w:val="en-US"/>
+        </w:rPr>
+        <w:t>In this module, the spikes are eliminated</w:t>
+      </w:r>
+      <w:r>
+        <w:rPr>
+          <w:lang w:val="en-US"/>
+        </w:rPr>
+        <w:t xml:space="preserve">, </w:t>
+      </w:r>
+      <w:r>
+        <w:rPr>
+          <w:lang w:val="en-US"/>
+        </w:rPr>
+        <w:t>the integration intervals are set</w:t>
+      </w:r>
+      <w:r>
+        <w:rPr>
+          <w:lang w:val="en-US"/>
+        </w:rPr>
+        <w:t xml:space="preserve"> and in case of inclusion analysis the host-inclusion-mixed signal </w:t>
+      </w:r>
+      <w:r>
+        <w:rPr>
+          <w:lang w:val="en-US"/>
+        </w:rPr>
+        <w:t>can be</w:t>
+      </w:r>
+      <w:r>
+        <w:rPr>
+          <w:lang w:val="en-US"/>
+        </w:rPr>
+        <w:t xml:space="preserve"> </w:t>
+      </w:r>
+      <w:r>
+        <w:rPr>
+          <w:lang w:val="en-US"/>
+        </w:rPr>
+        <w:t>deconvolved</w:t>
+      </w:r>
+      <w:r>
+        <w:rPr>
+          <w:lang w:val="en-US"/>
+        </w:rPr>
+        <w:t>.</w:t>
+      </w:r>
+    </w:p>
+    <w:p>
+      <w:pPr>
+        <w:pStyle w:val="ListParagraph"/>
+        <w:numPr>
+          <w:ilvl w:val="0"/>
+          <w:numId w:val="8"/>
+        </w:numPr>
+        <w:jc w:val="both"/>
+        <w:rPr>
+          <w:lang w:val="en-US"/>
+        </w:rPr>
+      </w:pPr>
+      <w:r>
+        <w:rPr>
+          <w:lang w:val="en-US"/>
+        </w:rPr>
+        <w:t>Spike elimination</w:t>
+      </w:r>
+    </w:p>
+    <w:p>
+      <w:pPr>
+        <w:pStyle w:val="ListParagraph"/>
+        <w:numPr>
+          <w:ilvl w:val="1"/>
+          <w:numId w:val="8"/>
+        </w:numPr>
+        <w:jc w:val="both"/>
+        <w:rPr>
+          <w:lang w:val="en-US"/>
+        </w:rPr>
+      </w:pPr>
+      <w:r>
+        <w:rPr>
+          <w:lang w:val="en-US"/>
+        </w:rPr>
+        <w:t>Works spot-wise</w:t>
+      </w:r>
+      <w:r>
+        <w:rPr>
+          <w:lang w:val="en-US"/>
+        </w:rPr>
+        <w:t xml:space="preserve"> via 7</w:t>
+      </w:r>
+      <w:r>
+        <w:rPr>
+          <w:lang w:val="en-US"/>
+        </w:rPr>
+        <w:t xml:space="preserve"> and 9</w:t>
+      </w:r>
+      <w:r>
+        <w:rPr>
+          <w:lang w:val="en-US"/>
+        </w:rPr>
+        <w:t>-sweep window Grubbs’s test</w:t>
+      </w:r>
+    </w:p>
+    <w:p>
+      <w:pPr>
+        <w:pStyle w:val="ListParagraph"/>
+        <w:numPr>
+          <w:ilvl w:val="1"/>
+          <w:numId w:val="8"/>
+        </w:numPr>
+        <w:jc w:val="both"/>
+        <w:rPr>
+          <w:lang w:val="en-US"/>
+        </w:rPr>
+      </w:pPr>
+      <w:r>
+        <w:rPr>
+          <w:lang w:val="en-US"/>
+        </w:rPr>
+        <w:t>Press “Spike Elimination” button</w:t>
+      </w:r>
+    </w:p>
+    <w:p>
+      <w:pPr>
+        <w:pStyle w:val="ListParagraph"/>
+        <w:numPr>
+          <w:ilvl w:val="1"/>
+          <w:numId w:val="8"/>
+        </w:numPr>
+        <w:jc w:val="both"/>
+        <w:rPr>
+          <w:lang w:val="en-US"/>
+        </w:rPr>
+      </w:pPr>
+      <w:r>
+        <w:rPr>
+          <w:lang w:val="en-US"/>
+        </w:rPr>
+        <w:t>Right-click on button and press “Apply globall</w:t>
+      </w:r>
+      <w:r>
+        <w:rPr>
+          <w:lang w:val="en-US"/>
+        </w:rPr>
+        <w:t>y</w:t>
+      </w:r>
+      <w:r>
+        <w:rPr>
+          <w:lang w:val="en-US"/>
+        </w:rPr>
+        <w:t>”</w:t>
+      </w:r>
+    </w:p>
+    <w:p>
+      <w:pPr>
+        <w:pStyle w:val="ListParagraph"/>
+        <w:numPr>
+          <w:ilvl w:val="2"/>
+          <w:numId w:val="8"/>
+        </w:numPr>
+        <w:jc w:val="both"/>
+        <w:rPr>
+          <w:lang w:val="en-US"/>
+        </w:rPr>
+      </w:pPr>
+      <w:r>
+        <w:rPr>
+          <w:lang w:val="en-US"/>
+        </w:rPr>
+        <w:t>Same is possible to reset it</w:t>
+      </w:r>
+    </w:p>
+    <w:p>
+      <w:pPr>
+        <w:pStyle w:val="ListParagraph"/>
+        <w:numPr>
+          <w:ilvl w:val="1"/>
+          <w:numId w:val="8"/>
+        </w:numPr>
+        <w:jc w:val="both"/>
+        <w:rPr>
+          <w:lang w:val="en-US"/>
+        </w:rPr>
+      </w:pPr>
+      <w:r>
+        <w:rPr>
+          <w:lang w:val="en-US"/>
+        </w:rPr>
+        <w:t>No spikes are eliminating in the inclusion intervals</w:t>
+      </w:r>
+      <w:r>
+        <w:rPr>
+          <w:lang w:val="en-US"/>
+        </w:rPr>
+        <w:t xml:space="preserve"> by the “Spike Elimination” button or the “Apply globally” option</w:t>
+      </w:r>
+    </w:p>
+    <w:p>
+      <w:pPr>
+        <w:pStyle w:val="ListParagraph"/>
+        <w:numPr>
+          <w:ilvl w:val="2"/>
+          <w:numId w:val="8"/>
+        </w:numPr>
+        <w:jc w:val="both"/>
+        <w:rPr>
+          <w:lang w:val="en-US"/>
+        </w:rPr>
+      </w:pPr>
+      <w:r>
+        <w:rPr>
+          <w:lang w:val="en-US"/>
+        </w:rPr>
+        <w:t>Spikes in the inclusion intervals can be manually accepted or ignored via right-click on the “Spike elimination” button and then selecting “Individual (Inclusion only)</w:t>
+      </w:r>
+      <w:r>
+        <w:rPr>
+          <w:lang w:val="en-US"/>
+        </w:rPr>
+        <w:t>”.</w:t>
+      </w:r>
+    </w:p>
+    <w:p>
+      <w:pPr>
+        <w:pStyle w:val="ListParagraph"/>
+        <w:numPr>
+          <w:ilvl w:val="1"/>
+          <w:numId w:val="8"/>
+        </w:numPr>
+        <w:jc w:val="both"/>
+        <w:rPr>
+          <w:lang w:val="en-US"/>
+        </w:rPr>
+      </w:pPr>
+      <w:r>
+        <w:rPr>
+          <w:lang w:val="en-US"/>
+        </w:rPr>
+        <w:t>To manually accept or ignore all spikes select “Individual” after right-clicking the “Spike Elimination” button.</w:t>
+      </w:r>
+    </w:p>
+    <w:p>
+      <w:pPr>
+        <w:pStyle w:val="ListParagraph"/>
+        <w:numPr>
+          <w:ilvl w:val="1"/>
+          <w:numId w:val="8"/>
+        </w:numPr>
+        <w:jc w:val="both"/>
+        <w:rPr>
+          <w:lang w:val="en-US"/>
+        </w:rPr>
+      </w:pPr>
+      <w:r>
+        <w:rPr>
+          <w:lang w:val="en-US"/>
+        </w:rPr>
+        <w:t>Change spike elimination settings in the menu on top</w:t>
+      </w:r>
+    </w:p>
+    <w:p>
+      <w:pPr>
+        <w:pStyle w:val="ListParagraph"/>
+        <w:numPr>
+          <w:ilvl w:val="0"/>
+          <w:numId w:val="8"/>
+        </w:numPr>
+        <w:jc w:val="both"/>
+        <w:rPr>
+          <w:lang w:val="en-US"/>
+        </w:rPr>
+      </w:pPr>
+      <w:r>
+        <w:rPr>
+          <w:lang w:val="en-US"/>
+        </w:rPr>
+        <w:t>I</w:t>
+      </w:r>
+      <w:r>
+        <w:rPr>
+          <w:lang w:val="en-US"/>
+        </w:rPr>
+        <w:t>nterval setting</w:t>
+      </w:r>
+    </w:p>
+    <w:p>
+      <w:pPr>
+        <w:pStyle w:val="ListParagraph"/>
+        <w:numPr>
+          <w:ilvl w:val="1"/>
+          <w:numId w:val="8"/>
+        </w:numPr>
+        <w:jc w:val="both"/>
+        <w:rPr>
+          <w:lang w:val="en-US"/>
+        </w:rPr>
+      </w:pPr>
+      <w:r>
+        <w:rPr>
+          <w:lang w:val="en-US"/>
+        </w:rPr>
+        <w:t>Global Interval Setting</w:t>
+      </w:r>
+    </w:p>
+    <w:p>
+      <w:pPr>
+        <w:pStyle w:val="ListParagraph"/>
+        <w:numPr>
+          <w:ilvl w:val="2"/>
+          <w:numId w:val="8"/>
+        </w:numPr>
+        <w:jc w:val="both"/>
+        <w:rPr>
+          <w:lang w:val="en-US"/>
+        </w:rPr>
+      </w:pPr>
+      <w:r>
+        <w:rPr>
+          <w:lang w:val="en-US"/>
+        </w:rPr>
+        <w:t>Changes the intervals globally</w:t>
+      </w:r>
+    </w:p>
+    <w:p>
+      <w:pPr>
+        <w:pStyle w:val="ListParagraph"/>
+        <w:numPr>
+          <w:ilvl w:val="2"/>
+          <w:numId w:val="8"/>
+        </w:numPr>
+        <w:jc w:val="both"/>
+        <w:rPr>
+          <w:lang w:val="en-US"/>
+        </w:rPr>
+      </w:pPr>
+      <w:r>
+        <w:rPr>
+          <w:lang w:val="en-US"/>
+        </w:rPr>
+        <w:t>Depends on the signal start and end as detected in the Import Module</w:t>
+      </w:r>
+    </w:p>
+    <w:p>
+      <w:pPr>
+        <w:pStyle w:val="ListParagraph"/>
+        <w:numPr>
+          <w:ilvl w:val="2"/>
+          <w:numId w:val="8"/>
+        </w:numPr>
+        <w:jc w:val="both"/>
+        <w:rPr>
+          <w:lang w:val="en-US"/>
+        </w:rPr>
+      </w:pPr>
+      <w:r>
+        <w:rPr>
+          <w:lang w:val="en-US"/>
+        </w:rPr>
+        <w:t xml:space="preserve">The numbers </w:t>
+      </w:r>
+      <w:r>
+        <w:rPr>
+          <w:lang w:val="en-US"/>
+        </w:rPr>
+        <w:t>and ± 1, ±10 are the number of sweeps that are intend from the starts and ends</w:t>
+      </w:r>
+    </w:p>
+    <w:p>
+      <w:pPr>
+        <w:pStyle w:val="ListParagraph"/>
+        <w:numPr>
+          <w:ilvl w:val="2"/>
+          <w:numId w:val="8"/>
+        </w:numPr>
+        <w:jc w:val="both"/>
+        <w:rPr>
+          <w:lang w:val="en-US"/>
+        </w:rPr>
+      </w:pPr>
+      <w:r>
+        <w:rPr>
+          <w:lang w:val="en-US"/>
+        </w:rPr>
+        <w:t>Also moves the intervals that were manually adjusted so watch out</w:t>
+      </w:r>
+    </w:p>
+    <w:p>
+      <w:pPr>
+        <w:pStyle w:val="ListParagraph"/>
+        <w:numPr>
+          <w:ilvl w:val="2"/>
+          <w:numId w:val="8"/>
+        </w:numPr>
+        <w:jc w:val="both"/>
+        <w:rPr>
+          <w:lang w:val="en-US"/>
+        </w:rPr>
+      </w:pPr>
+      <w:r>
+        <w:rPr>
+          <w:lang w:val="en-US"/>
+        </w:rPr>
+        <w:t>By right-clicking on the “Set XY” buttons the intervals can be adjusted spot group wise</w:t>
+      </w:r>
+    </w:p>
+    <w:p>
+      <w:pPr>
+        <w:pStyle w:val="ListParagraph"/>
+        <w:numPr>
+          <w:ilvl w:val="1"/>
+          <w:numId w:val="8"/>
+        </w:numPr>
+        <w:jc w:val="both"/>
+        <w:rPr>
+          <w:lang w:val="en-US"/>
+        </w:rPr>
+      </w:pPr>
+      <w:r>
+        <w:rPr>
+          <w:lang w:val="en-US"/>
+        </w:rPr>
+        <w:t>Local Interval Setting</w:t>
+      </w:r>
+    </w:p>
+    <w:p>
+      <w:pPr>
+        <w:pStyle w:val="ListParagraph"/>
+        <w:numPr>
+          <w:ilvl w:val="2"/>
+          <w:numId w:val="8"/>
+        </w:numPr>
+        <w:jc w:val="both"/>
+        <w:rPr>
+          <w:lang w:val="en-US"/>
+        </w:rPr>
+      </w:pPr>
+      <w:r>
+        <w:rPr>
+          <w:lang w:val="en-US"/>
+        </w:rPr>
+        <w:t>Set intervals by dragging and dropping the cursor over the plot</w:t>
+      </w:r>
+    </w:p>
+    <w:p>
+      <w:pPr>
+        <w:pStyle w:val="ListParagraph"/>
+        <w:numPr>
+          <w:ilvl w:val="2"/>
+          <w:numId w:val="8"/>
+        </w:numPr>
+        <w:jc w:val="both"/>
+        <w:rPr>
+          <w:lang w:val="en-US"/>
+        </w:rPr>
+      </w:pPr>
+      <w:r>
+        <w:rPr>
+          <w:lang w:val="en-US"/>
+        </w:rPr>
+        <w:t>In Inclusion Mode there is also the “Inclusion” interval</w:t>
+      </w:r>
+    </w:p>
+    <w:p>
+      <w:pPr>
+        <w:pStyle w:val="ListParagraph"/>
+        <w:numPr>
+          <w:ilvl w:val="1"/>
+          <w:numId w:val="8"/>
+        </w:numPr>
+        <w:jc w:val="both"/>
+        <w:rPr>
+          <w:lang w:val="en-US"/>
+        </w:rPr>
+      </w:pPr>
+      <w:r>
+        <w:rPr>
+          <w:lang w:val="en-US"/>
+        </w:rPr>
+        <w:t>Manually m</w:t>
+      </w:r>
+      <w:r>
+        <w:rPr>
+          <w:lang w:val="en-US"/>
+        </w:rPr>
+        <w:t>oving intervals</w:t>
+      </w:r>
+    </w:p>
+    <w:p>
+      <w:pPr>
+        <w:pStyle w:val="ListParagraph"/>
+        <w:numPr>
+          <w:ilvl w:val="2"/>
+          <w:numId w:val="8"/>
+        </w:numPr>
+        <w:jc w:val="both"/>
+        <w:rPr>
+          <w:lang w:val="en-US"/>
+        </w:rPr>
+      </w:pPr>
+      <w:r>
+        <w:rPr>
+          <w:lang w:val="en-US"/>
+        </w:rPr>
+        <w:t>Click, hold, drag and drop the middle or borders of the intervals to adjust them</w:t>
+      </w:r>
+    </w:p>
+    <w:p>
+      <w:pPr>
+        <w:pStyle w:val="ListParagraph"/>
+        <w:numPr>
+          <w:ilvl w:val="2"/>
+          <w:numId w:val="8"/>
+        </w:numPr>
+        <w:jc w:val="both"/>
+        <w:rPr>
+          <w:lang w:val="en-US"/>
+        </w:rPr>
+      </w:pPr>
+      <w:r>
+        <w:rPr>
+          <w:lang w:val="en-US"/>
+        </w:rPr>
+        <w:t>This just changes the one interval that was moved</w:t>
+      </w:r>
+    </w:p>
+    <w:p>
+      <w:pPr>
+        <w:pStyle w:val="ListParagraph"/>
+        <w:numPr>
+          <w:ilvl w:val="0"/>
+          <w:numId w:val="8"/>
+        </w:numPr>
+        <w:jc w:val="both"/>
+        <w:rPr>
+          <w:lang w:val="en-US"/>
+        </w:rPr>
+      </w:pPr>
+      <w:r>
+        <w:rPr>
+          <w:lang w:val="en-US"/>
+        </w:rPr>
+        <w:t xml:space="preserve">Host-Inclusion </w:t>
+      </w:r>
+      <w:r>
+        <w:rPr>
+          <w:lang w:val="en-US"/>
+        </w:rPr>
+        <w:t>Signal unmixing</w:t>
+      </w:r>
+    </w:p>
+    <w:p>
+      <w:pPr>
+        <w:pStyle w:val="ListParagraph"/>
+        <w:numPr>
+          <w:ilvl w:val="1"/>
+          <w:numId w:val="8"/>
+        </w:numPr>
+        <w:jc w:val="both"/>
+        <w:rPr>
+          <w:lang w:val="en-US"/>
+        </w:rPr>
+      </w:pPr>
+      <w:r>
+        <w:rPr>
+          <w:lang w:val="en-US"/>
+        </w:rPr>
+        <w:t>Only in Inclusion Mode</w:t>
+      </w:r>
+    </w:p>
+    <w:p>
+      <w:pPr>
+        <w:pStyle w:val="ListParagraph"/>
+        <w:numPr>
+          <w:ilvl w:val="1"/>
+          <w:numId w:val="8"/>
+        </w:numPr>
+        <w:jc w:val="both"/>
+        <w:rPr>
+          <w:lang w:val="en-US"/>
+        </w:rPr>
+      </w:pPr>
+      <w:r>
+        <w:rPr>
+          <w:lang w:val="en-US"/>
+        </w:rPr>
+        <w:t>Only visible when plotting background-corrected</w:t>
+      </w:r>
+    </w:p>
+    <w:p>
+      <w:pPr>
+        <w:pStyle w:val="ListParagraph"/>
+        <w:numPr>
+          <w:ilvl w:val="1"/>
+          <w:numId w:val="8"/>
+        </w:numPr>
+        <w:jc w:val="both"/>
+        <w:rPr>
+          <w:lang w:val="en-US"/>
+        </w:rPr>
+      </w:pPr>
+      <w:r>
+        <w:rPr>
+          <w:lang w:val="en-US"/>
+        </w:rPr>
+        <w:t>Matrix-only tracer</w:t>
+      </w:r>
+    </w:p>
+    <w:p>
+      <w:pPr>
+        <w:pStyle w:val="ListParagraph"/>
+        <w:numPr>
+          <w:ilvl w:val="2"/>
+          <w:numId w:val="8"/>
+        </w:numPr>
+        <w:jc w:val="both"/>
+        <w:rPr>
+          <w:lang w:val="en-US"/>
+        </w:rPr>
+      </w:pPr>
+      <w:r>
+        <w:rPr>
+          <w:lang w:val="en-US"/>
+        </w:rPr>
+        <w:t>Choose element and spot to take the host from</w:t>
+      </w:r>
+    </w:p>
+    <w:p>
+      <w:pPr>
+        <w:pStyle w:val="ListParagraph"/>
+        <w:numPr>
+          <w:ilvl w:val="1"/>
+          <w:numId w:val="8"/>
+        </w:numPr>
+        <w:jc w:val="both"/>
+        <w:rPr>
+          <w:lang w:val="en-US"/>
+        </w:rPr>
+      </w:pPr>
+      <w:r>
+        <w:rPr>
+          <w:lang w:val="en-US"/>
+        </w:rPr>
+        <w:t>Two internal standards</w:t>
+      </w:r>
+    </w:p>
+    <w:p>
+      <w:pPr>
+        <w:pStyle w:val="ListParagraph"/>
+        <w:numPr>
+          <w:ilvl w:val="2"/>
+          <w:numId w:val="8"/>
+        </w:numPr>
+        <w:jc w:val="both"/>
+        <w:rPr>
+          <w:lang w:val="en-US"/>
+        </w:rPr>
+      </w:pPr>
+      <w:r>
+        <w:rPr>
+          <w:lang w:val="en-US"/>
+        </w:rPr>
+        <w:t>Values are input in Quantification Module</w:t>
+      </w:r>
+    </w:p>
+    <w:p>
+      <w:pPr>
+        <w:pStyle w:val="ListParagraph"/>
+        <w:numPr>
+          <w:ilvl w:val="0"/>
+          <w:numId w:val="8"/>
+        </w:numPr>
+        <w:jc w:val="both"/>
+        <w:rPr>
+          <w:lang w:val="en-US"/>
+        </w:rPr>
+      </w:pPr>
+      <w:r>
+        <w:rPr>
+          <w:lang w:val="en-US"/>
+        </w:rPr>
+        <w:t>Plot styles</w:t>
+      </w:r>
+    </w:p>
+    <w:p>
+      <w:pPr>
+        <w:pStyle w:val="ListParagraph"/>
+        <w:numPr>
+          <w:ilvl w:val="1"/>
+          <w:numId w:val="8"/>
+        </w:numPr>
+        <w:jc w:val="both"/>
+        <w:rPr>
+          <w:lang w:val="en-US"/>
+        </w:rPr>
+      </w:pPr>
+      <w:r>
+        <w:rPr>
+          <w:lang w:val="en-US"/>
+        </w:rPr>
+        <w:lastRenderedPageBreak/>
+        <w:t>Make them yourself</w:t>
+      </w:r>
+    </w:p>
+    <w:p>
+      <w:pPr>
+        <w:pStyle w:val="ListParagraph"/>
+        <w:numPr>
+          <w:ilvl w:val="2"/>
+          <w:numId w:val="8"/>
+        </w:numPr>
+        <w:jc w:val="both"/>
+        <w:rPr>
+          <w:lang w:val="en-US"/>
+        </w:rPr>
+      </w:pPr>
+      <w:r>
+        <w:rPr>
+          <w:lang w:val="en-US"/>
+        </w:rPr>
+        <w:t>Navigate to ICP-Base folder</w:t>
+      </w:r>
+      <w:r>
+        <w:rPr>
+          <w:lang w:val="en-US"/>
+        </w:rPr>
+        <w:t xml:space="preserve"> (Documents/ICP-Base)</w:t>
+      </w:r>
+    </w:p>
+    <w:p>
+      <w:pPr>
+        <w:pStyle w:val="ListParagraph"/>
+        <w:numPr>
+          <w:ilvl w:val="2"/>
+          <w:numId w:val="8"/>
+        </w:numPr>
+        <w:jc w:val="both"/>
+        <w:rPr>
+          <w:lang w:val="en-US"/>
+        </w:rPr>
+      </w:pPr>
+      <w:r>
+        <w:rPr>
+          <w:lang w:val="en-US"/>
+        </w:rPr>
+        <w:t>Get subfolder “Plot_Styles”</w:t>
+      </w:r>
+    </w:p>
+    <w:p>
+      <w:pPr>
+        <w:pStyle w:val="ListParagraph"/>
+        <w:numPr>
+          <w:ilvl w:val="2"/>
+          <w:numId w:val="8"/>
+        </w:numPr>
+        <w:jc w:val="both"/>
+        <w:rPr>
+          <w:lang w:val="en-US"/>
+        </w:rPr>
+      </w:pPr>
+      <w:r>
+        <w:rPr>
+          <w:lang w:val="en-US"/>
+        </w:rPr>
+        <w:t>Based on .csv files</w:t>
+      </w:r>
+    </w:p>
+    <w:p>
+      <w:pPr>
+        <w:pStyle w:val="ListParagraph"/>
+        <w:numPr>
+          <w:ilvl w:val="3"/>
+          <w:numId w:val="8"/>
+        </w:numPr>
+        <w:jc w:val="both"/>
+        <w:rPr>
+          <w:lang w:val="en-US"/>
+        </w:rPr>
+      </w:pPr>
+      <w:r>
+        <w:rPr>
+          <w:lang w:val="en-US"/>
+        </w:rPr>
+        <w:t>Open/Delete/Change the plot styles</w:t>
+      </w:r>
+    </w:p>
+    <w:p>
+      <w:pPr>
+        <w:pStyle w:val="ListParagraph"/>
+        <w:numPr>
+          <w:ilvl w:val="3"/>
+          <w:numId w:val="8"/>
+        </w:numPr>
+        <w:jc w:val="both"/>
+        <w:rPr>
+          <w:lang w:val="en-US"/>
+        </w:rPr>
+      </w:pPr>
+      <w:r>
+        <w:rPr>
+          <w:lang w:val="en-US"/>
+        </w:rPr>
+        <w:t>Also able to plot ratios</w:t>
+      </w:r>
+    </w:p>
+    <w:p>
+      <w:pPr>
+        <w:pStyle w:val="ListParagraph"/>
+        <w:numPr>
+          <w:ilvl w:val="1"/>
+          <w:numId w:val="8"/>
+        </w:numPr>
+        <w:jc w:val="both"/>
+        <w:rPr>
+          <w:lang w:val="en-US"/>
+        </w:rPr>
+      </w:pPr>
+      <w:r>
+        <w:rPr>
+          <w:lang w:val="en-US"/>
+        </w:rPr>
+        <w:t>Right-click on the top right list box</w:t>
+      </w:r>
+    </w:p>
+    <w:p>
+      <w:pPr>
+        <w:pStyle w:val="ListParagraph"/>
+        <w:numPr>
+          <w:ilvl w:val="2"/>
+          <w:numId w:val="8"/>
+        </w:numPr>
+        <w:jc w:val="both"/>
+        <w:rPr>
+          <w:lang w:val="en-US"/>
+        </w:rPr>
+      </w:pPr>
+      <w:r>
+        <w:rPr>
+          <w:lang w:val="en-US"/>
+        </w:rPr>
+        <w:t>Press “Refresh” to load in new or changed plot style</w:t>
+      </w:r>
+    </w:p>
+    <w:p>
+      <w:pPr>
+        <w:pStyle w:val="ListParagraph"/>
+        <w:numPr>
+          <w:ilvl w:val="0"/>
+          <w:numId w:val="8"/>
+        </w:numPr>
+        <w:jc w:val="both"/>
+        <w:rPr>
+          <w:lang w:val="en-US"/>
+        </w:rPr>
+      </w:pPr>
+      <w:r>
+        <w:rPr>
+          <w:lang w:val="en-US"/>
+        </w:rPr>
+        <w:t>General visualization features</w:t>
+      </w:r>
+    </w:p>
+    <w:p>
+      <w:pPr>
+        <w:pStyle w:val="ListParagraph"/>
+        <w:numPr>
+          <w:ilvl w:val="1"/>
+          <w:numId w:val="8"/>
+        </w:numPr>
+        <w:jc w:val="both"/>
+        <w:rPr>
+          <w:lang w:val="en-US"/>
+        </w:rPr>
+      </w:pPr>
+      <w:r>
+        <w:rPr>
+          <w:lang w:val="en-US"/>
+        </w:rPr>
+        <w:t xml:space="preserve">If the built-in zoom function is used (top-right icons in the plot) make sure to </w:t>
+      </w:r>
+      <w:r>
+        <w:rPr>
+          <w:lang w:val="en-US"/>
+        </w:rPr>
+        <w:t>de</w:t>
+      </w:r>
+      <w:r>
+        <w:rPr>
+          <w:lang w:val="en-US"/>
+        </w:rPr>
+        <w:t>select the zoom function by clicking on it again. Otherwise you cannot move the intervals anymore.</w:t>
+      </w:r>
+    </w:p>
+    <w:p>
+      <w:pPr>
+        <w:jc w:val="both"/>
+        <w:rPr>
+          <w:b/>
+          <w:bCs/>
+          <w:lang w:val="en-US"/>
+        </w:rPr>
+      </w:pPr>
+      <w:r>
+        <w:rPr>
+          <w:b/>
+          <w:bCs/>
+          <w:lang w:val="en-US"/>
+        </w:rPr>
+        <w:t>If you</w:t>
+      </w:r>
+    </w:p>
+    <w:p>
+      <w:pPr>
+        <w:ind w:left="360"/>
+        <w:jc w:val="both"/>
+        <w:rPr>
+          <w:b/>
+          <w:bCs/>
+          <w:lang w:val="en-US"/>
+        </w:rPr>
+      </w:pPr>
+      <w:r>
+        <w:rPr>
+          <w:b/>
+          <w:bCs/>
+          <w:lang w:val="en-US"/>
+        </w:rPr>
+        <w:t xml:space="preserve">1. </w:t>
+      </w:r>
+      <w:r>
+        <w:rPr>
+          <w:b/>
+          <w:bCs/>
+          <w:lang w:val="en-US"/>
+        </w:rPr>
+        <w:t>Eliminated the spikes,</w:t>
+      </w:r>
+    </w:p>
+    <w:p>
+      <w:pPr>
+        <w:ind w:left="360"/>
+        <w:jc w:val="both"/>
+        <w:rPr>
+          <w:b/>
+          <w:bCs/>
+          <w:lang w:val="en-US"/>
+        </w:rPr>
+      </w:pPr>
+      <w:r>
+        <w:rPr>
+          <w:b/>
+          <w:bCs/>
+          <w:lang w:val="en-US"/>
+        </w:rPr>
+        <w:t xml:space="preserve">2. </w:t>
+      </w:r>
+      <w:r>
+        <w:rPr>
+          <w:b/>
+          <w:bCs/>
+          <w:lang w:val="en-US"/>
+        </w:rPr>
+        <w:t>set the integration intervals and</w:t>
+      </w:r>
+    </w:p>
+    <w:p>
+      <w:pPr>
+        <w:ind w:left="360"/>
+        <w:jc w:val="both"/>
+        <w:rPr>
+          <w:b/>
+          <w:bCs/>
+          <w:lang w:val="en-US"/>
+        </w:rPr>
+      </w:pPr>
+      <w:r>
+        <w:rPr>
+          <w:b/>
+          <w:bCs/>
+          <w:lang w:val="en-US"/>
+        </w:rPr>
+        <w:t>3. in case of inclusion analysis chose a method of unmixing</w:t>
+      </w:r>
+    </w:p>
+    <w:p>
+      <w:pPr>
+        <w:jc w:val="both"/>
+        <w:rPr>
+          <w:b/>
+          <w:bCs/>
+          <w:lang w:val="en-US"/>
+        </w:rPr>
+      </w:pPr>
+      <w:r>
+        <w:rPr>
           <w:b/>
           <w:bCs/>
           <w:lang w:val="en-US"/>
@@ -3806,18 +3088,65 @@
           <w:bCs/>
           <w:lang w:val="en-US"/>
         </w:rPr>
-        <w:t xml:space="preserve">to the </w:t>
-      </w:r>
-      <w:r>
-        <w:rPr>
-          <w:b/>
-          <w:bCs/>
-          <w:lang w:val="en-US"/>
-        </w:rPr>
-        <w:t>Drift Module</w:t>
-      </w:r>
-      <w:r>
-        <w:rPr>
+        <w:t>to the Classification Module</w:t>
+      </w:r>
+    </w:p>
+    <w:p>
+      <w:pPr>
+        <w:jc w:val="both"/>
+        <w:rPr>
+          <w:b/>
+          <w:bCs/>
+          <w:lang w:val="en-US"/>
+        </w:rPr>
+      </w:pPr>
+    </w:p>
+    <w:p>
+      <w:pPr>
+        <w:jc w:val="both"/>
+        <w:rPr>
+          <w:i/>
+          <w:iCs/>
+          <w:lang w:val="en-US"/>
+        </w:rPr>
+      </w:pPr>
+      <w:r>
+        <w:rPr>
+          <w:i/>
+          <w:iCs/>
+          <w:lang w:val="en-US"/>
+        </w:rPr>
+        <w:t xml:space="preserve">Additional features: </w:t>
+      </w:r>
+      <w:r>
+        <w:rPr>
+          <w:i/>
+          <w:iCs/>
+          <w:lang w:val="en-US"/>
+        </w:rPr>
+        <w:t xml:space="preserve">Spike elimination report, Change Plot Styles folder path, </w:t>
+      </w:r>
+      <w:r>
+        <w:rPr>
+          <w:i/>
+          <w:iCs/>
+          <w:lang w:val="en-US"/>
+        </w:rPr>
+        <w:t>add comments to spots</w:t>
+      </w:r>
+    </w:p>
+    <w:p>
+      <w:pPr>
+        <w:rPr>
+          <w:i/>
+          <w:iCs/>
+          <w:lang w:val="en-US"/>
+        </w:rPr>
+      </w:pPr>
+      <w:r>
+        <w:rPr>
+          <w:i/>
+          <w:iCs/>
           <w:lang w:val="en-US"/>
         </w:rPr>
         <w:br w:type="page"/>
@@ -3836,7 +3165,7 @@
           <w:lang w:val="en-US"/>
         </w:rPr>
         <w:lastRenderedPageBreak/>
-        <w:t>Drift Module</w:t>
+        <w:t>Classification Module</w:t>
       </w:r>
     </w:p>
     <w:p>
@@ -3856,7 +3185,45 @@
         <w:rPr>
           <w:lang w:val="en-US"/>
         </w:rPr>
-        <w:t>you cannot</w:t>
+        <w:t>the spots are assigned roles</w:t>
+      </w:r>
+    </w:p>
+    <w:p>
+      <w:pPr>
+        <w:pStyle w:val="ListParagraph"/>
+        <w:numPr>
+          <w:ilvl w:val="0"/>
+          <w:numId w:val="9"/>
+        </w:numPr>
+        <w:jc w:val="both"/>
+        <w:rPr>
+          <w:lang w:val="en-US"/>
+        </w:rPr>
+      </w:pPr>
+      <w:r>
+        <w:rPr>
+          <w:lang w:val="en-US"/>
+        </w:rPr>
+        <w:t>Types</w:t>
+      </w:r>
+    </w:p>
+    <w:p>
+      <w:pPr>
+        <w:pStyle w:val="ListParagraph"/>
+        <w:numPr>
+          <w:ilvl w:val="1"/>
+          <w:numId w:val="9"/>
+        </w:numPr>
+        <w:jc w:val="both"/>
+        <w:rPr>
+          <w:lang w:val="en-US"/>
+        </w:rPr>
+      </w:pPr>
+      <w:r>
+        <w:rPr>
+          <w:lang w:val="en-US"/>
+        </w:rPr>
+        <w:t>“Unknown”</w:t>
       </w:r>
       <w:r>
         <w:rPr>
@@ -3868,7 +3235,190 @@
         <w:rPr>
           <w:lang w:val="en-US"/>
         </w:rPr>
-        <w:t>give any input in the software. The drift is calculated for you in a fixed manner. All you have to do is look and think!</w:t>
+        <w:t>is an unknown</w:t>
+      </w:r>
+      <w:r>
+        <w:rPr>
+          <w:lang w:val="en-US"/>
+        </w:rPr>
+        <w:t xml:space="preserve"> that should be quantified</w:t>
+      </w:r>
+    </w:p>
+    <w:p>
+      <w:pPr>
+        <w:pStyle w:val="ListParagraph"/>
+        <w:numPr>
+          <w:ilvl w:val="1"/>
+          <w:numId w:val="9"/>
+        </w:numPr>
+        <w:jc w:val="both"/>
+        <w:rPr>
+          <w:lang w:val="en-US"/>
+        </w:rPr>
+      </w:pPr>
+      <w:r>
+        <w:rPr>
+          <w:lang w:val="en-US"/>
+        </w:rPr>
+        <w:t>“</w:t>
+      </w:r>
+      <w:r>
+        <w:rPr>
+          <w:lang w:val="en-US"/>
+        </w:rPr>
+        <w:t>Interference Correction Material</w:t>
+      </w:r>
+      <w:r>
+        <w:rPr>
+          <w:lang w:val="en-US"/>
+        </w:rPr>
+        <w:t>” (</w:t>
+      </w:r>
+      <w:r>
+        <w:rPr>
+          <w:lang w:val="en-US"/>
+        </w:rPr>
+        <w:t>ICM</w:t>
+      </w:r>
+      <w:r>
+        <w:rPr>
+          <w:lang w:val="en-US"/>
+        </w:rPr>
+        <w:t xml:space="preserve">) is </w:t>
+      </w:r>
+      <w:r>
+        <w:rPr>
+          <w:lang w:val="en-US"/>
+        </w:rPr>
+        <w:t>used to correct for interferences.</w:t>
+      </w:r>
+    </w:p>
+    <w:p>
+      <w:pPr>
+        <w:pStyle w:val="ListParagraph"/>
+        <w:numPr>
+          <w:ilvl w:val="1"/>
+          <w:numId w:val="9"/>
+        </w:numPr>
+        <w:jc w:val="both"/>
+        <w:rPr>
+          <w:lang w:val="en-US"/>
+        </w:rPr>
+      </w:pPr>
+      <w:r>
+        <w:rPr>
+          <w:lang w:val="en-US"/>
+        </w:rPr>
+        <w:t>“</w:t>
+      </w:r>
+      <w:r>
+        <w:rPr>
+          <w:lang w:val="en-US"/>
+        </w:rPr>
+        <w:t xml:space="preserve">Quality </w:t>
+      </w:r>
+      <w:r>
+        <w:rPr>
+          <w:lang w:val="en-US"/>
+        </w:rPr>
+        <w:t>C</w:t>
+      </w:r>
+      <w:r>
+        <w:rPr>
+          <w:lang w:val="en-US"/>
+        </w:rPr>
+        <w:t xml:space="preserve">ontrol </w:t>
+      </w:r>
+      <w:r>
+        <w:rPr>
+          <w:lang w:val="en-US"/>
+        </w:rPr>
+        <w:t>Reference Material</w:t>
+      </w:r>
+      <w:r>
+        <w:rPr>
+          <w:lang w:val="en-US"/>
+        </w:rPr>
+        <w:t>” (</w:t>
+      </w:r>
+      <w:r>
+        <w:rPr>
+          <w:lang w:val="en-US"/>
+        </w:rPr>
+        <w:t>Q</w:t>
+      </w:r>
+      <w:r>
+        <w:rPr>
+          <w:lang w:val="en-US"/>
+        </w:rPr>
+        <w:t>C</w:t>
+      </w:r>
+      <w:r>
+        <w:rPr>
+          <w:lang w:val="en-US"/>
+        </w:rPr>
+        <w:t>RM</w:t>
+      </w:r>
+      <w:r>
+        <w:rPr>
+          <w:lang w:val="en-US"/>
+        </w:rPr>
+        <w:t>) is treated like an unknown but has a known composition to which the results can be compared to.</w:t>
+      </w:r>
+    </w:p>
+    <w:p>
+      <w:pPr>
+        <w:pStyle w:val="ListParagraph"/>
+        <w:numPr>
+          <w:ilvl w:val="1"/>
+          <w:numId w:val="9"/>
+        </w:numPr>
+        <w:jc w:val="both"/>
+        <w:rPr>
+          <w:lang w:val="en-US"/>
+        </w:rPr>
+      </w:pPr>
+      <w:r>
+        <w:rPr>
+          <w:lang w:val="en-US"/>
+        </w:rPr>
+        <w:t>“</w:t>
+      </w:r>
+      <w:r>
+        <w:rPr>
+          <w:lang w:val="en-US"/>
+        </w:rPr>
+        <w:t>Calibrat</w:t>
+      </w:r>
+      <w:r>
+        <w:rPr>
+          <w:lang w:val="en-US"/>
+        </w:rPr>
+        <w:t>or</w:t>
+      </w:r>
+      <w:r>
+        <w:rPr>
+          <w:lang w:val="en-US"/>
+        </w:rPr>
+        <w:t>” (</w:t>
+      </w:r>
+      <w:r>
+        <w:rPr>
+          <w:lang w:val="en-US"/>
+        </w:rPr>
+        <w:t>C</w:t>
+      </w:r>
+      <w:r>
+        <w:rPr>
+          <w:lang w:val="en-US"/>
+        </w:rPr>
+        <w:t>AL</w:t>
+      </w:r>
+      <w:r>
+        <w:rPr>
+          <w:lang w:val="en-US"/>
+        </w:rPr>
+        <w:t>) is actually used for the quantification of the other types.</w:t>
       </w:r>
     </w:p>
     <w:p>
@@ -3876,29 +3426,18 @@
         <w:pStyle w:val="ListParagraph"/>
         <w:numPr>
           <w:ilvl w:val="0"/>
-          <w:numId w:val="10"/>
-        </w:numPr>
-        <w:rPr>
-          <w:lang w:val="en-US"/>
-        </w:rPr>
-      </w:pPr>
-      <w:r>
-        <w:rPr>
-          <w:lang w:val="en-US"/>
-        </w:rPr>
-        <w:t xml:space="preserve">The plot visualizes the drift of the sensitivities of all analytes of a given </w:t>
-      </w:r>
-      <w:r>
-        <w:rPr>
-          <w:lang w:val="en-US"/>
-        </w:rPr>
-        <w:t xml:space="preserve">calibrator </w:t>
-      </w:r>
-      <w:r>
-        <w:rPr>
-          <w:lang w:val="en-US"/>
-        </w:rPr>
-        <w:t>and bracket id pair</w:t>
+          <w:numId w:val="9"/>
+        </w:numPr>
+        <w:jc w:val="both"/>
+        <w:rPr>
+          <w:lang w:val="en-US"/>
+        </w:rPr>
+      </w:pPr>
+      <w:r>
+        <w:rPr>
+          <w:lang w:val="en-US"/>
+        </w:rPr>
+        <w:t>Reference Materials</w:t>
       </w:r>
     </w:p>
     <w:p>
@@ -3906,23 +3445,58 @@
         <w:pStyle w:val="ListParagraph"/>
         <w:numPr>
           <w:ilvl w:val="1"/>
-          <w:numId w:val="10"/>
-        </w:numPr>
-        <w:rPr>
-          <w:lang w:val="en-US"/>
-        </w:rPr>
-      </w:pPr>
-      <w:r>
-        <w:rPr>
-          <w:lang w:val="en-US"/>
-        </w:rPr>
-        <w:t>The dots are the sensitivities</w:t>
-      </w:r>
-      <w:r>
-        <w:rPr>
-          <w:lang w:val="en-US"/>
-        </w:rPr>
-        <w:t xml:space="preserve"> (vertical axis)</w:t>
+          <w:numId w:val="9"/>
+        </w:numPr>
+        <w:jc w:val="both"/>
+        <w:rPr>
+          <w:lang w:val="en-US"/>
+        </w:rPr>
+      </w:pPr>
+      <w:r>
+        <w:rPr>
+          <w:lang w:val="en-US"/>
+        </w:rPr>
+        <w:t xml:space="preserve">Their compositions are stored in files in the subfolder </w:t>
+      </w:r>
+      <w:proofErr w:type="spellStart"/>
+      <w:r>
+        <w:rPr>
+          <w:lang w:val="en-US"/>
+        </w:rPr>
+        <w:t>RM_Files</w:t>
+      </w:r>
+      <w:proofErr w:type="spellEnd"/>
+      <w:r>
+        <w:rPr>
+          <w:lang w:val="en-US"/>
+        </w:rPr>
+        <w:t xml:space="preserve"> in the ICP-Base folder</w:t>
+      </w:r>
+      <w:r>
+        <w:rPr>
+          <w:lang w:val="en-US"/>
+        </w:rPr>
+        <w:t xml:space="preserve"> (Documents/ICP-Base)</w:t>
+      </w:r>
+      <w:r>
+        <w:rPr>
+          <w:lang w:val="en-US"/>
+        </w:rPr>
+        <w:t xml:space="preserve"> or in a custom set </w:t>
+      </w:r>
+      <w:proofErr w:type="spellStart"/>
+      <w:r>
+        <w:rPr>
+          <w:lang w:val="en-US"/>
+        </w:rPr>
+        <w:t>filepath</w:t>
+      </w:r>
+      <w:proofErr w:type="spellEnd"/>
+      <w:r>
+        <w:rPr>
+          <w:lang w:val="en-US"/>
+        </w:rPr>
+        <w:t xml:space="preserve"> (changed via the settings menu).</w:t>
       </w:r>
     </w:p>
     <w:p>
@@ -3930,17 +3504,37 @@
         <w:pStyle w:val="ListParagraph"/>
         <w:numPr>
           <w:ilvl w:val="1"/>
-          <w:numId w:val="10"/>
-        </w:numPr>
-        <w:rPr>
-          <w:lang w:val="en-US"/>
-        </w:rPr>
-      </w:pPr>
-      <w:r>
-        <w:rPr>
-          <w:lang w:val="en-US"/>
-        </w:rPr>
-        <w:t>Horizontal axis is time</w:t>
+          <w:numId w:val="9"/>
+        </w:numPr>
+        <w:jc w:val="both"/>
+        <w:rPr>
+          <w:lang w:val="en-US"/>
+        </w:rPr>
+      </w:pPr>
+      <w:r>
+        <w:rPr>
+          <w:lang w:val="en-US"/>
+        </w:rPr>
+        <w:t>Add/Change/Delete them as you like</w:t>
+      </w:r>
+    </w:p>
+    <w:p>
+      <w:pPr>
+        <w:pStyle w:val="ListParagraph"/>
+        <w:numPr>
+          <w:ilvl w:val="2"/>
+          <w:numId w:val="9"/>
+        </w:numPr>
+        <w:jc w:val="both"/>
+        <w:rPr>
+          <w:lang w:val="en-US"/>
+        </w:rPr>
+      </w:pPr>
+      <w:r>
+        <w:rPr>
+          <w:lang w:val="en-US"/>
+        </w:rPr>
+        <w:t>Press “Get RM files” to import the RM files from the folder</w:t>
       </w:r>
     </w:p>
     <w:p>
@@ -3948,29 +3542,18 @@
         <w:pStyle w:val="ListParagraph"/>
         <w:numPr>
           <w:ilvl w:val="0"/>
-          <w:numId w:val="10"/>
-        </w:numPr>
-        <w:rPr>
-          <w:lang w:val="en-US"/>
-        </w:rPr>
-      </w:pPr>
-      <w:r>
-        <w:rPr>
-          <w:lang w:val="en-US"/>
-        </w:rPr>
-        <w:t xml:space="preserve">Using the dropdown menus at the top you can navigate through the </w:t>
-      </w:r>
-      <w:r>
-        <w:rPr>
-          <w:lang w:val="en-US"/>
-        </w:rPr>
-        <w:t xml:space="preserve">calibrator </w:t>
-      </w:r>
-      <w:r>
-        <w:rPr>
-          <w:lang w:val="en-US"/>
-        </w:rPr>
-        <w:t>and bracket id pairs.</w:t>
+          <w:numId w:val="9"/>
+        </w:numPr>
+        <w:jc w:val="both"/>
+        <w:rPr>
+          <w:lang w:val="en-US"/>
+        </w:rPr>
+      </w:pPr>
+      <w:r>
+        <w:rPr>
+          <w:lang w:val="en-US"/>
+        </w:rPr>
+        <w:t>Assign types and reference materials to the spots by selecting them directly in the table or via string search</w:t>
       </w:r>
     </w:p>
     <w:p>
@@ -3978,23 +3561,18 @@
         <w:pStyle w:val="ListParagraph"/>
         <w:numPr>
           <w:ilvl w:val="0"/>
-          <w:numId w:val="10"/>
-        </w:numPr>
-        <w:rPr>
-          <w:lang w:val="en-US"/>
-        </w:rPr>
-      </w:pPr>
-      <w:r>
-        <w:rPr>
-          <w:lang w:val="en-US"/>
-        </w:rPr>
-        <w:t xml:space="preserve">Line </w:t>
-      </w:r>
-      <w:r>
-        <w:rPr>
-          <w:lang w:val="en-US"/>
-        </w:rPr>
-        <w:t>colors</w:t>
+          <w:numId w:val="9"/>
+        </w:numPr>
+        <w:jc w:val="both"/>
+        <w:rPr>
+          <w:lang w:val="en-US"/>
+        </w:rPr>
+      </w:pPr>
+      <w:r>
+        <w:rPr>
+          <w:lang w:val="en-US"/>
+        </w:rPr>
+        <w:t>Assign bracket ids if you measured the same reference material with e.g. different spot sizes to separate them.</w:t>
       </w:r>
     </w:p>
     <w:p>
@@ -4002,18 +3580,18 @@
         <w:pStyle w:val="ListParagraph"/>
         <w:numPr>
           <w:ilvl w:val="1"/>
-          <w:numId w:val="10"/>
-        </w:numPr>
-        <w:jc w:val="both"/>
-        <w:rPr>
-          <w:lang w:val="en-US"/>
-        </w:rPr>
-      </w:pPr>
-      <w:r>
-        <w:rPr>
-          <w:lang w:val="en-US"/>
-        </w:rPr>
-        <w:t xml:space="preserve">A blue line means that the sensitivity of a given analyte changed less than 5 % from the start of the bracket to the end of the bracket. </w:t>
+          <w:numId w:val="9"/>
+        </w:numPr>
+        <w:jc w:val="both"/>
+        <w:rPr>
+          <w:lang w:val="en-US"/>
+        </w:rPr>
+      </w:pPr>
+      <w:r>
+        <w:rPr>
+          <w:lang w:val="en-US"/>
+        </w:rPr>
+        <w:t>Different reference materials do not have to be separated by the different bracket ids. They are already separated by the fact that they are different reference materials</w:t>
       </w:r>
     </w:p>
     <w:p>
@@ -4021,55 +3599,18 @@
         <w:pStyle w:val="ListParagraph"/>
         <w:numPr>
           <w:ilvl w:val="1"/>
-          <w:numId w:val="10"/>
-        </w:numPr>
-        <w:jc w:val="both"/>
-        <w:rPr>
-          <w:lang w:val="en-US"/>
-        </w:rPr>
-      </w:pPr>
-      <w:r>
-        <w:rPr>
-          <w:lang w:val="en-US"/>
-        </w:rPr>
-        <w:t>Orange indicates a change of 5 to 10 %</w:t>
-      </w:r>
-      <w:r>
-        <w:rPr>
-          <w:lang w:val="en-US"/>
-        </w:rPr>
-        <w:t>.</w:t>
-      </w:r>
-    </w:p>
-    <w:p>
-      <w:pPr>
-        <w:pStyle w:val="ListParagraph"/>
-        <w:numPr>
-          <w:ilvl w:val="1"/>
-          <w:numId w:val="10"/>
-        </w:numPr>
-        <w:jc w:val="both"/>
-        <w:rPr>
-          <w:lang w:val="en-US"/>
-        </w:rPr>
-      </w:pPr>
-      <w:r>
-        <w:rPr>
-          <w:lang w:val="en-US"/>
-        </w:rPr>
-        <w:t>R</w:t>
-      </w:r>
-      <w:r>
-        <w:rPr>
-          <w:lang w:val="en-US"/>
-        </w:rPr>
-        <w:t>ed shows a change of more than 10 %</w:t>
-      </w:r>
-      <w:r>
-        <w:rPr>
-          <w:lang w:val="en-US"/>
-        </w:rPr>
-        <w:t>.</w:t>
+          <w:numId w:val="9"/>
+        </w:numPr>
+        <w:jc w:val="both"/>
+        <w:rPr>
+          <w:lang w:val="en-US"/>
+        </w:rPr>
+      </w:pPr>
+      <w:r>
+        <w:rPr>
+          <w:lang w:val="en-US"/>
+        </w:rPr>
+        <w:t>Bracket ids only should be used to separate spots of the same reference material</w:t>
       </w:r>
     </w:p>
     <w:p>
@@ -4077,29 +3618,43 @@
         <w:pStyle w:val="ListParagraph"/>
         <w:numPr>
           <w:ilvl w:val="0"/>
-          <w:numId w:val="10"/>
-        </w:numPr>
-        <w:rPr>
-          <w:lang w:val="en-US"/>
-        </w:rPr>
-      </w:pPr>
-      <w:r>
-        <w:rPr>
-          <w:lang w:val="en-US"/>
-        </w:rPr>
-        <w:t>If a standard measurement is off, you can go back to the Interval Module and delete th</w:t>
-      </w:r>
-      <w:r>
-        <w:rPr>
-          <w:lang w:val="en-US"/>
-        </w:rPr>
-        <w:t>is standard’s integration intervals to disregard it</w:t>
-      </w:r>
-      <w:r>
-        <w:rPr>
-          <w:lang w:val="en-US"/>
-        </w:rPr>
-        <w:t>.</w:t>
+          <w:numId w:val="9"/>
+        </w:numPr>
+        <w:jc w:val="both"/>
+        <w:rPr>
+          <w:lang w:val="en-US"/>
+        </w:rPr>
+      </w:pPr>
+      <w:r>
+        <w:rPr>
+          <w:lang w:val="en-US"/>
+        </w:rPr>
+        <w:t>Right click on a table row where an RM was assigned to look at the reference values of that RM.</w:t>
+      </w:r>
+      <w:r>
+        <w:rPr>
+          <w:lang w:val="en-US"/>
+        </w:rPr>
+        <w:t xml:space="preserve"> You can also read the path where the RM files are stored if you want to change them.</w:t>
+      </w:r>
+    </w:p>
+    <w:p>
+      <w:pPr>
+        <w:pStyle w:val="ListParagraph"/>
+        <w:numPr>
+          <w:ilvl w:val="0"/>
+          <w:numId w:val="9"/>
+        </w:numPr>
+        <w:jc w:val="both"/>
+        <w:rPr>
+          <w:lang w:val="en-US"/>
+        </w:rPr>
+      </w:pPr>
+      <w:r>
+        <w:rPr>
+          <w:lang w:val="en-US"/>
+        </w:rPr>
+        <w:t>Configure the interference correction if an ICM is chosen.</w:t>
       </w:r>
     </w:p>
     <w:p>
@@ -4143,67 +3698,114 @@
           <w:bCs/>
           <w:lang w:val="en-US"/>
         </w:rPr>
-        <w:t>1. Looked at the Drift and evaluated it</w:t>
-      </w:r>
-    </w:p>
-    <w:p>
-      <w:pPr>
-        <w:jc w:val="both"/>
-        <w:rPr>
-          <w:b/>
-          <w:bCs/>
-          <w:lang w:val="en-US"/>
-        </w:rPr>
-      </w:pPr>
-      <w:r>
-        <w:rPr>
-          <w:b/>
-          <w:bCs/>
-          <w:lang w:val="en-US"/>
-        </w:rPr>
-        <w:t xml:space="preserve">You can proceed </w:t>
-      </w:r>
-      <w:r>
-        <w:rPr>
-          <w:b/>
-          <w:bCs/>
-          <w:lang w:val="en-US"/>
-        </w:rPr>
-        <w:t xml:space="preserve">to the </w:t>
-      </w:r>
-      <w:r>
-        <w:rPr>
-          <w:b/>
-          <w:bCs/>
-          <w:lang w:val="en-US"/>
-        </w:rPr>
-        <w:t>Quantification</w:t>
-      </w:r>
-      <w:r>
-        <w:rPr>
-          <w:b/>
-          <w:bCs/>
-          <w:lang w:val="en-US"/>
-        </w:rPr>
-        <w:t xml:space="preserve"> Module</w:t>
-      </w:r>
-    </w:p>
-    <w:p>
-      <w:pPr>
-        <w:rPr>
-          <w:lang w:val="en-US"/>
-        </w:rPr>
-      </w:pPr>
-    </w:p>
-    <w:p>
-      <w:pPr>
-        <w:rPr>
-          <w:lang w:val="en-US"/>
-        </w:rPr>
-      </w:pPr>
-    </w:p>
-    <w:p>
-      <w:pPr>
+        <w:t xml:space="preserve">1. </w:t>
+      </w:r>
+      <w:r>
+        <w:rPr>
+          <w:b/>
+          <w:bCs/>
+          <w:lang w:val="en-US"/>
+        </w:rPr>
+        <w:t>Classified ea</w:t>
+      </w:r>
+      <w:r>
+        <w:rPr>
+          <w:b/>
+          <w:bCs/>
+          <w:lang w:val="en-US"/>
+        </w:rPr>
+        <w:t xml:space="preserve">ch spot </w:t>
+      </w:r>
+      <w:r>
+        <w:rPr>
+          <w:b/>
+          <w:bCs/>
+          <w:lang w:val="en-US"/>
+        </w:rPr>
+        <w:t>has a role</w:t>
+      </w:r>
+      <w:r>
+        <w:rPr>
+          <w:b/>
+          <w:bCs/>
+          <w:lang w:val="en-US"/>
+        </w:rPr>
+        <w:t xml:space="preserve"> and</w:t>
+      </w:r>
+    </w:p>
+    <w:p>
+      <w:pPr>
+        <w:ind w:left="360"/>
+        <w:jc w:val="both"/>
+        <w:rPr>
+          <w:b/>
+          <w:bCs/>
+          <w:lang w:val="en-US"/>
+        </w:rPr>
+      </w:pPr>
+      <w:r>
+        <w:rPr>
+          <w:b/>
+          <w:bCs/>
+          <w:lang w:val="en-US"/>
+        </w:rPr>
+        <w:t xml:space="preserve">2. </w:t>
+      </w:r>
+      <w:r>
+        <w:rPr>
+          <w:b/>
+          <w:bCs/>
+          <w:lang w:val="en-US"/>
+        </w:rPr>
+        <w:t xml:space="preserve">separated the </w:t>
+      </w:r>
+      <w:r>
+        <w:rPr>
+          <w:b/>
+          <w:bCs/>
+          <w:lang w:val="en-US"/>
+        </w:rPr>
+        <w:t>CAL</w:t>
+      </w:r>
+      <w:r>
+        <w:rPr>
+          <w:b/>
+          <w:bCs/>
+          <w:lang w:val="en-US"/>
+        </w:rPr>
+        <w:t xml:space="preserve"> via bracket id (if necessary)</w:t>
+      </w:r>
+      <w:r>
+        <w:rPr>
+          <w:b/>
+          <w:bCs/>
+          <w:lang w:val="en-US"/>
+        </w:rPr>
+        <w:t xml:space="preserve"> and</w:t>
+      </w:r>
+    </w:p>
+    <w:p>
+      <w:pPr>
+        <w:ind w:left="360"/>
+        <w:jc w:val="both"/>
+        <w:rPr>
+          <w:b/>
+          <w:bCs/>
+          <w:lang w:val="en-US"/>
+        </w:rPr>
+      </w:pPr>
+      <w:r>
+        <w:rPr>
+          <w:b/>
+          <w:bCs/>
+          <w:lang w:val="en-US"/>
+        </w:rPr>
+        <w:t>3. configured the interference correction (if an ICM was chosen)</w:t>
+      </w:r>
+    </w:p>
+    <w:p>
+      <w:pPr>
+        <w:jc w:val="both"/>
         <w:rPr>
           <w:rFonts w:asciiTheme="majorHAnsi" w:eastAsiaTheme="majorEastAsia" w:hAnsiTheme="majorHAnsi" w:cstheme="majorBidi"/>
           <w:b/>
@@ -4215,6 +3817,427 @@
       </w:pPr>
       <w:r>
         <w:rPr>
+          <w:b/>
+          <w:bCs/>
+          <w:lang w:val="en-US"/>
+        </w:rPr>
+        <w:t xml:space="preserve">You can proceed </w:t>
+      </w:r>
+      <w:r>
+        <w:rPr>
+          <w:b/>
+          <w:bCs/>
+          <w:lang w:val="en-US"/>
+        </w:rPr>
+        <w:t xml:space="preserve">to the </w:t>
+      </w:r>
+      <w:r>
+        <w:rPr>
+          <w:b/>
+          <w:bCs/>
+          <w:lang w:val="en-US"/>
+        </w:rPr>
+        <w:t>Drift Module</w:t>
+      </w:r>
+      <w:r>
+        <w:rPr>
+          <w:lang w:val="en-US"/>
+        </w:rPr>
+        <w:br w:type="page"/>
+      </w:r>
+    </w:p>
+    <w:p>
+      <w:pPr>
+        <w:pStyle w:val="Heading1"/>
+        <w:jc w:val="both"/>
+        <w:rPr>
+          <w:lang w:val="en-US"/>
+        </w:rPr>
+      </w:pPr>
+      <w:r>
+        <w:rPr>
+          <w:lang w:val="en-US"/>
+        </w:rPr>
+        <w:lastRenderedPageBreak/>
+        <w:t>Drift Module</w:t>
+      </w:r>
+    </w:p>
+    <w:p>
+      <w:pPr>
+        <w:jc w:val="both"/>
+        <w:rPr>
+          <w:lang w:val="en-US"/>
+        </w:rPr>
+      </w:pPr>
+      <w:r>
+        <w:rPr>
+          <w:lang w:val="en-US"/>
+        </w:rPr>
+        <w:t xml:space="preserve">In this module, </w:t>
+      </w:r>
+      <w:r>
+        <w:rPr>
+          <w:lang w:val="en-US"/>
+        </w:rPr>
+        <w:t>you cannot</w:t>
+      </w:r>
+      <w:r>
+        <w:rPr>
+          <w:lang w:val="en-US"/>
+        </w:rPr>
+        <w:t xml:space="preserve"> </w:t>
+      </w:r>
+      <w:r>
+        <w:rPr>
+          <w:lang w:val="en-US"/>
+        </w:rPr>
+        <w:t>give any input in the software. The drift is calculated for you in a fixed manner. All you have to do is look and think!</w:t>
+      </w:r>
+    </w:p>
+    <w:p>
+      <w:pPr>
+        <w:pStyle w:val="ListParagraph"/>
+        <w:numPr>
+          <w:ilvl w:val="0"/>
+          <w:numId w:val="10"/>
+        </w:numPr>
+        <w:rPr>
+          <w:lang w:val="en-US"/>
+        </w:rPr>
+      </w:pPr>
+      <w:r>
+        <w:rPr>
+          <w:lang w:val="en-US"/>
+        </w:rPr>
+        <w:t xml:space="preserve">The plot visualizes the drift of the sensitivities of all analytes of a given </w:t>
+      </w:r>
+      <w:r>
+        <w:rPr>
+          <w:lang w:val="en-US"/>
+        </w:rPr>
+        <w:t xml:space="preserve">calibrator </w:t>
+      </w:r>
+      <w:r>
+        <w:rPr>
+          <w:lang w:val="en-US"/>
+        </w:rPr>
+        <w:t>and bracket id pair</w:t>
+      </w:r>
+    </w:p>
+    <w:p>
+      <w:pPr>
+        <w:pStyle w:val="ListParagraph"/>
+        <w:numPr>
+          <w:ilvl w:val="1"/>
+          <w:numId w:val="10"/>
+        </w:numPr>
+        <w:rPr>
+          <w:lang w:val="en-US"/>
+        </w:rPr>
+      </w:pPr>
+      <w:r>
+        <w:rPr>
+          <w:lang w:val="en-US"/>
+        </w:rPr>
+        <w:t>The dots are the sensitivities</w:t>
+      </w:r>
+      <w:r>
+        <w:rPr>
+          <w:lang w:val="en-US"/>
+        </w:rPr>
+        <w:t xml:space="preserve"> (vertical axis)</w:t>
+      </w:r>
+    </w:p>
+    <w:p>
+      <w:pPr>
+        <w:pStyle w:val="ListParagraph"/>
+        <w:numPr>
+          <w:ilvl w:val="1"/>
+          <w:numId w:val="10"/>
+        </w:numPr>
+        <w:rPr>
+          <w:lang w:val="en-US"/>
+        </w:rPr>
+      </w:pPr>
+      <w:r>
+        <w:rPr>
+          <w:lang w:val="en-US"/>
+        </w:rPr>
+        <w:t>Horizontal axis is time</w:t>
+      </w:r>
+    </w:p>
+    <w:p>
+      <w:pPr>
+        <w:pStyle w:val="ListParagraph"/>
+        <w:numPr>
+          <w:ilvl w:val="0"/>
+          <w:numId w:val="10"/>
+        </w:numPr>
+        <w:rPr>
+          <w:lang w:val="en-US"/>
+        </w:rPr>
+      </w:pPr>
+      <w:r>
+        <w:rPr>
+          <w:lang w:val="en-US"/>
+        </w:rPr>
+        <w:t xml:space="preserve">Using the dropdown menus at the top you can navigate through the </w:t>
+      </w:r>
+      <w:r>
+        <w:rPr>
+          <w:lang w:val="en-US"/>
+        </w:rPr>
+        <w:t xml:space="preserve">calibrator </w:t>
+      </w:r>
+      <w:r>
+        <w:rPr>
+          <w:lang w:val="en-US"/>
+        </w:rPr>
+        <w:t>and bracket id pairs.</w:t>
+      </w:r>
+    </w:p>
+    <w:p>
+      <w:pPr>
+        <w:pStyle w:val="ListParagraph"/>
+        <w:numPr>
+          <w:ilvl w:val="0"/>
+          <w:numId w:val="10"/>
+        </w:numPr>
+        <w:rPr>
+          <w:lang w:val="en-US"/>
+        </w:rPr>
+      </w:pPr>
+      <w:r>
+        <w:rPr>
+          <w:lang w:val="en-US"/>
+        </w:rPr>
+        <w:t xml:space="preserve">Line </w:t>
+      </w:r>
+      <w:r>
+        <w:rPr>
+          <w:lang w:val="en-US"/>
+        </w:rPr>
+        <w:t>colors</w:t>
+      </w:r>
+    </w:p>
+    <w:p>
+      <w:pPr>
+        <w:pStyle w:val="ListParagraph"/>
+        <w:numPr>
+          <w:ilvl w:val="1"/>
+          <w:numId w:val="10"/>
+        </w:numPr>
+        <w:jc w:val="both"/>
+        <w:rPr>
+          <w:lang w:val="en-US"/>
+        </w:rPr>
+      </w:pPr>
+      <w:r>
+        <w:rPr>
+          <w:lang w:val="en-US"/>
+        </w:rPr>
+        <w:t xml:space="preserve">A blue line means that the sensitivity of a given analyte changed less than 5 % from the start of the bracket to the end of the bracket. </w:t>
+      </w:r>
+    </w:p>
+    <w:p>
+      <w:pPr>
+        <w:pStyle w:val="ListParagraph"/>
+        <w:numPr>
+          <w:ilvl w:val="1"/>
+          <w:numId w:val="10"/>
+        </w:numPr>
+        <w:jc w:val="both"/>
+        <w:rPr>
+          <w:lang w:val="en-US"/>
+        </w:rPr>
+      </w:pPr>
+      <w:r>
+        <w:rPr>
+          <w:lang w:val="en-US"/>
+        </w:rPr>
+        <w:t>Orange indicates a change of 5 to 10 %</w:t>
+      </w:r>
+      <w:r>
+        <w:rPr>
+          <w:lang w:val="en-US"/>
+        </w:rPr>
+        <w:t>.</w:t>
+      </w:r>
+    </w:p>
+    <w:p>
+      <w:pPr>
+        <w:pStyle w:val="ListParagraph"/>
+        <w:numPr>
+          <w:ilvl w:val="1"/>
+          <w:numId w:val="10"/>
+        </w:numPr>
+        <w:jc w:val="both"/>
+        <w:rPr>
+          <w:lang w:val="en-US"/>
+        </w:rPr>
+      </w:pPr>
+      <w:r>
+        <w:rPr>
+          <w:lang w:val="en-US"/>
+        </w:rPr>
+        <w:t>R</w:t>
+      </w:r>
+      <w:r>
+        <w:rPr>
+          <w:lang w:val="en-US"/>
+        </w:rPr>
+        <w:t>ed shows a change of more than 10 %</w:t>
+      </w:r>
+      <w:r>
+        <w:rPr>
+          <w:lang w:val="en-US"/>
+        </w:rPr>
+        <w:t>.</w:t>
+      </w:r>
+    </w:p>
+    <w:p>
+      <w:pPr>
+        <w:pStyle w:val="ListParagraph"/>
+        <w:numPr>
+          <w:ilvl w:val="0"/>
+          <w:numId w:val="10"/>
+        </w:numPr>
+        <w:rPr>
+          <w:lang w:val="en-US"/>
+        </w:rPr>
+      </w:pPr>
+      <w:r>
+        <w:rPr>
+          <w:lang w:val="en-US"/>
+        </w:rPr>
+        <w:t>If a standard measurement is off, you can go back to the Interval Module and delete th</w:t>
+      </w:r>
+      <w:r>
+        <w:rPr>
+          <w:lang w:val="en-US"/>
+        </w:rPr>
+        <w:t>is standard’s integration intervals to disregard it</w:t>
+      </w:r>
+      <w:r>
+        <w:rPr>
+          <w:lang w:val="en-US"/>
+        </w:rPr>
+        <w:t>.</w:t>
+      </w:r>
+    </w:p>
+    <w:p>
+      <w:pPr>
+        <w:rPr>
+          <w:lang w:val="en-US"/>
+        </w:rPr>
+      </w:pPr>
+    </w:p>
+    <w:p>
+      <w:pPr>
+        <w:jc w:val="both"/>
+        <w:rPr>
+          <w:b/>
+          <w:bCs/>
+          <w:lang w:val="en-US"/>
+        </w:rPr>
+      </w:pPr>
+      <w:r>
+        <w:rPr>
+          <w:b/>
+          <w:bCs/>
+          <w:lang w:val="en-US"/>
+        </w:rPr>
+        <w:t>If you</w:t>
+      </w:r>
+    </w:p>
+    <w:p>
+      <w:pPr>
+        <w:ind w:left="360"/>
+        <w:jc w:val="both"/>
+        <w:rPr>
+          <w:b/>
+          <w:bCs/>
+          <w:lang w:val="en-US"/>
+        </w:rPr>
+      </w:pPr>
+      <w:r>
+        <w:rPr>
+          <w:b/>
+          <w:bCs/>
+          <w:lang w:val="en-US"/>
+        </w:rPr>
+        <w:t>1. Looked at the Drift and evaluated it</w:t>
+      </w:r>
+    </w:p>
+    <w:p>
+      <w:pPr>
+        <w:jc w:val="both"/>
+        <w:rPr>
+          <w:b/>
+          <w:bCs/>
+          <w:lang w:val="en-US"/>
+        </w:rPr>
+      </w:pPr>
+      <w:r>
+        <w:rPr>
+          <w:b/>
+          <w:bCs/>
+          <w:lang w:val="en-US"/>
+        </w:rPr>
+        <w:t xml:space="preserve">You can proceed </w:t>
+      </w:r>
+      <w:r>
+        <w:rPr>
+          <w:b/>
+          <w:bCs/>
+          <w:lang w:val="en-US"/>
+        </w:rPr>
+        <w:t xml:space="preserve">to the </w:t>
+      </w:r>
+      <w:r>
+        <w:rPr>
+          <w:b/>
+          <w:bCs/>
+          <w:lang w:val="en-US"/>
+        </w:rPr>
+        <w:t>Quantification</w:t>
+      </w:r>
+      <w:r>
+        <w:rPr>
+          <w:b/>
+          <w:bCs/>
+          <w:lang w:val="en-US"/>
+        </w:rPr>
+        <w:t xml:space="preserve"> Module</w:t>
+      </w:r>
+    </w:p>
+    <w:p>
+      <w:pPr>
+        <w:rPr>
+          <w:lang w:val="en-US"/>
+        </w:rPr>
+      </w:pPr>
+    </w:p>
+    <w:p>
+      <w:pPr>
+        <w:rPr>
+          <w:lang w:val="en-US"/>
+        </w:rPr>
+      </w:pPr>
+    </w:p>
+    <w:p>
+      <w:pPr>
+        <w:rPr>
+          <w:rFonts w:asciiTheme="majorHAnsi" w:eastAsiaTheme="majorEastAsia" w:hAnsiTheme="majorHAnsi" w:cstheme="majorBidi"/>
+          <w:b/>
+          <w:color w:val="000000" w:themeColor="text1"/>
+          <w:sz w:val="32"/>
+          <w:szCs w:val="40"/>
+          <w:lang w:val="en-US"/>
+        </w:rPr>
+      </w:pPr>
+      <w:r>
+        <w:rPr>
           <w:lang w:val="en-US"/>
         </w:rPr>
         <w:br w:type="page"/>
@@ -4753,6 +4776,31 @@
     </w:p>
     <w:p>
       <w:pPr>
+        <w:pStyle w:val="ListParagraph"/>
+        <w:numPr>
+          <w:ilvl w:val="0"/>
+          <w:numId w:val="11"/>
+        </w:numPr>
+        <w:jc w:val="both"/>
+        <w:rPr>
+          <w:lang w:val="en-US"/>
+        </w:rPr>
+      </w:pPr>
+      <w:r>
+        <w:rPr>
+          <w:lang w:val="en-US"/>
+        </w:rPr>
+        <w:t>Enable internal standard uncertainties if wanted</w:t>
+      </w:r>
+      <w:r>
+        <w:rPr>
+          <w:lang w:val="en-US"/>
+        </w:rPr>
+        <w:t xml:space="preserve"> (Settings Menu)</w:t>
+      </w:r>
+    </w:p>
+    <w:p>
+      <w:pPr>
         <w:jc w:val="both"/>
         <w:rPr>
           <w:b/>
@@ -4845,6 +4893,7 @@
           <w:iCs/>
           <w:lang w:val="en-US"/>
         </w:rPr>
+        <w:lastRenderedPageBreak/>
         <w:t>Additional features:</w:t>
       </w:r>
       <w:r>
@@ -4868,7 +4917,6 @@
         <w:rPr>
           <w:lang w:val="en-US"/>
         </w:rPr>
-        <w:lastRenderedPageBreak/>
         <w:t>Results Module</w:t>
       </w:r>
     </w:p>
@@ -4901,7 +4949,19 @@
         <w:rPr>
           <w:lang w:val="en-US"/>
         </w:rPr>
-        <w:t xml:space="preserve">, compared SRMs to reference values and makes it possible to </w:t>
+        <w:t xml:space="preserve">, compared </w:t>
+      </w:r>
+      <w:r>
+        <w:rPr>
+          <w:lang w:val="en-US"/>
+        </w:rPr>
+        <w:t>QCRMs</w:t>
+      </w:r>
+      <w:r>
+        <w:rPr>
+          <w:lang w:val="en-US"/>
+        </w:rPr>
+        <w:t xml:space="preserve"> to reference values and makes it possible to </w:t>
       </w:r>
       <w:r>
         <w:rPr>
@@ -5183,7 +5243,13 @@
         <w:rPr>
           <w:lang w:val="en-US"/>
         </w:rPr>
-        <w:t>Secondary Reference Material</w:t>
+        <w:t>Quality Control</w:t>
+      </w:r>
+      <w:r>
+        <w:rPr>
+          <w:lang w:val="en-US"/>
+        </w:rPr>
+        <w:t xml:space="preserve"> Reference Material</w:t>
       </w:r>
     </w:p>
     <w:p>
@@ -5201,7 +5267,19 @@
         <w:rPr>
           <w:lang w:val="en-US"/>
         </w:rPr>
-        <w:t xml:space="preserve">Ratios the results of a secondary reference material  by its “Real Value” which comes from the reference material file (.csv in </w:t>
+        <w:t xml:space="preserve">Ratios the results of a </w:t>
+      </w:r>
+      <w:r>
+        <w:rPr>
+          <w:lang w:val="en-US"/>
+        </w:rPr>
+        <w:t>quality control</w:t>
+      </w:r>
+      <w:r>
+        <w:rPr>
+          <w:lang w:val="en-US"/>
+        </w:rPr>
+        <w:t xml:space="preserve"> reference material  by its “Real Value” which comes from the reference material file (.csv in </w:t>
       </w:r>
       <w:proofErr w:type="spellStart"/>
       <w:r>
@@ -5369,7 +5447,15 @@
           <w:bCs/>
           <w:lang w:val="en-US"/>
         </w:rPr>
-        <w:t>Evaluated the SRMs</w:t>
+        <w:t xml:space="preserve">Evaluated the </w:t>
+      </w:r>
+      <w:r>
+        <w:rPr>
+          <w:b/>
+          <w:bCs/>
+          <w:lang w:val="en-US"/>
+        </w:rPr>
+        <w:t>QCRMs</w:t>
       </w:r>
       <w:r>
         <w:rPr>
@@ -7898,6 +7984,7 @@
   <w:style w:type="character" w:default="1" w:styleId="DefaultParagraphFont">
     <w:name w:val="Default Paragraph Font"/>
     <w:uiPriority w:val="1"/>
+    <w:semiHidden/>
     <w:unhideWhenUsed/>
   </w:style>
   <w:style w:type="table" w:default="1" w:styleId="TableNormal">

</xml_diff>